<commit_message>
Modified Jenkins Task file
</commit_message>
<xml_diff>
--- a/Jenkins Task -1 .docx
+++ b/Jenkins Task -1 .docx
@@ -476,23 +476,7 @@
           <w:sz w:val="28"/>
           <w:szCs w:val="28"/>
         </w:rPr>
-        <w:t xml:space="preserve">Now open </w:t>
-      </w:r>
-      <w:proofErr w:type="spellStart"/>
-      <w:r>
-        <w:rPr>
-          <w:sz w:val="28"/>
-          <w:szCs w:val="28"/>
-        </w:rPr>
-        <w:t>Jenkins.service</w:t>
-      </w:r>
-      <w:proofErr w:type="spellEnd"/>
-      <w:r>
-        <w:rPr>
-          <w:sz w:val="28"/>
-          <w:szCs w:val="28"/>
-        </w:rPr>
-        <w:t xml:space="preserve"> file and change the port to 8081</w:t>
+        <w:t>Now open Jenkins.service file and change the port to 8081</w:t>
       </w:r>
       <w:r>
         <w:rPr>
@@ -572,6 +556,7 @@
       </w:pPr>
       <w:r>
         <w:rPr>
+          <w:noProof/>
           <w:sz w:val="28"/>
           <w:szCs w:val="28"/>
         </w:rPr>
@@ -641,6 +626,7 @@
       </w:pPr>
       <w:r>
         <w:rPr>
+          <w:noProof/>
           <w:sz w:val="28"/>
           <w:szCs w:val="28"/>
         </w:rPr>
@@ -812,9 +798,8 @@
           <w:szCs w:val="28"/>
           <w:shd w:val="clear" w:color="auto" w:fill="F9F2F4"/>
         </w:rPr>
-        <w:t>/var/lib/</w:t>
-      </w:r>
-      <w:proofErr w:type="spellStart"/>
+        <w:t>/var/lib/jenkins/secrets/initialAdminPassword</w:t>
+      </w:r>
       <w:r>
         <w:rPr>
           <w:rFonts w:cstheme="minorHAnsi"/>
@@ -825,45 +810,6 @@
           <w:szCs w:val="28"/>
           <w:shd w:val="clear" w:color="auto" w:fill="F9F2F4"/>
         </w:rPr>
-        <w:t>jenkins</w:t>
-      </w:r>
-      <w:proofErr w:type="spellEnd"/>
-      <w:r>
-        <w:rPr>
-          <w:rFonts w:cstheme="minorHAnsi"/>
-          <w:b/>
-          <w:bCs/>
-          <w:color w:val="000000" w:themeColor="text1"/>
-          <w:sz w:val="28"/>
-          <w:szCs w:val="28"/>
-          <w:shd w:val="clear" w:color="auto" w:fill="F9F2F4"/>
-        </w:rPr>
-        <w:t>/secrets/</w:t>
-      </w:r>
-      <w:proofErr w:type="spellStart"/>
-      <w:r>
-        <w:rPr>
-          <w:rFonts w:cstheme="minorHAnsi"/>
-          <w:b/>
-          <w:bCs/>
-          <w:color w:val="000000" w:themeColor="text1"/>
-          <w:sz w:val="28"/>
-          <w:szCs w:val="28"/>
-          <w:shd w:val="clear" w:color="auto" w:fill="F9F2F4"/>
-        </w:rPr>
-        <w:t>initialAdminPassword</w:t>
-      </w:r>
-      <w:proofErr w:type="spellEnd"/>
-      <w:r>
-        <w:rPr>
-          <w:rFonts w:cstheme="minorHAnsi"/>
-          <w:b/>
-          <w:bCs/>
-          <w:color w:val="000000" w:themeColor="text1"/>
-          <w:sz w:val="28"/>
-          <w:szCs w:val="28"/>
-          <w:shd w:val="clear" w:color="auto" w:fill="F9F2F4"/>
-        </w:rPr>
         <w:t xml:space="preserve">, </w:t>
       </w:r>
       <w:r>
@@ -896,6 +842,7 @@
       <w:r>
         <w:rPr>
           <w:rFonts w:eastAsia="Times New Roman" w:cstheme="minorHAnsi"/>
+          <w:noProof/>
           <w:color w:val="1D1C1D"/>
           <w:kern w:val="0"/>
           <w:sz w:val="28"/>
@@ -959,6 +906,7 @@
       <w:r>
         <w:rPr>
           <w:rFonts w:eastAsia="Times New Roman" w:cstheme="minorHAnsi"/>
+          <w:noProof/>
           <w:color w:val="1D1C1D"/>
           <w:kern w:val="0"/>
           <w:sz w:val="28"/>
@@ -1030,33 +978,7 @@
           <w14:ligatures w14:val="none"/>
         </w:rPr>
         <w:lastRenderedPageBreak/>
-        <w:t xml:space="preserve">Step </w:t>
-      </w:r>
-      <w:proofErr w:type="gramStart"/>
-      <w:r>
-        <w:rPr>
-          <w:rFonts w:eastAsia="Times New Roman" w:cstheme="minorHAnsi"/>
-          <w:color w:val="1D1C1D"/>
-          <w:kern w:val="0"/>
-          <w:sz w:val="28"/>
-          <w:szCs w:val="28"/>
-          <w:lang w:eastAsia="en-IN" w:bidi="ta-IN"/>
-          <w14:ligatures w14:val="none"/>
-        </w:rPr>
-        <w:t>2:Goto</w:t>
-      </w:r>
-      <w:proofErr w:type="gramEnd"/>
-      <w:r>
-        <w:rPr>
-          <w:rFonts w:eastAsia="Times New Roman" w:cstheme="minorHAnsi"/>
-          <w:color w:val="1D1C1D"/>
-          <w:kern w:val="0"/>
-          <w:sz w:val="28"/>
-          <w:szCs w:val="28"/>
-          <w:lang w:eastAsia="en-IN" w:bidi="ta-IN"/>
-          <w14:ligatures w14:val="none"/>
-        </w:rPr>
-        <w:t xml:space="preserve"> security and change the password.</w:t>
+        <w:t>Step 2:Goto security and change the password.</w:t>
       </w:r>
     </w:p>
     <w:p>
@@ -1078,6 +1000,7 @@
       <w:r>
         <w:rPr>
           <w:rFonts w:eastAsia="Times New Roman" w:cstheme="minorHAnsi"/>
+          <w:noProof/>
           <w:color w:val="1D1C1D"/>
           <w:kern w:val="0"/>
           <w:sz w:val="28"/>
@@ -1150,7 +1073,6 @@
         </w:rPr>
         <w:t xml:space="preserve">Step 3: Now delete </w:t>
       </w:r>
-      <w:proofErr w:type="spellStart"/>
       <w:r>
         <w:rPr>
           <w:rFonts w:eastAsia="Times New Roman" w:cstheme="minorHAnsi"/>
@@ -1163,22 +1085,7 @@
           <w:lang w:eastAsia="en-IN" w:bidi="ta-IN"/>
           <w14:ligatures w14:val="none"/>
         </w:rPr>
-        <w:t>InitialAdminPassword</w:t>
-      </w:r>
-      <w:proofErr w:type="spellEnd"/>
-      <w:r>
-        <w:rPr>
-          <w:rFonts w:eastAsia="Times New Roman" w:cstheme="minorHAnsi"/>
-          <w:b/>
-          <w:bCs/>
-          <w:color w:val="1D1C1D"/>
-          <w:kern w:val="0"/>
-          <w:sz w:val="28"/>
-          <w:szCs w:val="28"/>
-          <w:lang w:eastAsia="en-IN" w:bidi="ta-IN"/>
-          <w14:ligatures w14:val="none"/>
-        </w:rPr>
-        <w:t xml:space="preserve"> </w:t>
+        <w:t xml:space="preserve">InitialAdminPassword </w:t>
       </w:r>
       <w:r>
         <w:rPr>
@@ -1212,6 +1119,7 @@
       <w:r>
         <w:rPr>
           <w:rFonts w:eastAsia="Times New Roman" w:cstheme="minorHAnsi"/>
+          <w:noProof/>
           <w:color w:val="1D1C1D"/>
           <w:kern w:val="0"/>
           <w:sz w:val="28"/>
@@ -1462,6 +1370,7 @@
       <w:r>
         <w:rPr>
           <w:rFonts w:eastAsia="Times New Roman" w:cstheme="minorHAnsi"/>
+          <w:noProof/>
           <w:color w:val="1D1C1D"/>
           <w:kern w:val="0"/>
           <w:sz w:val="28"/>
@@ -1534,6 +1443,7 @@
       </w:pPr>
       <w:r>
         <w:rPr>
+          <w:noProof/>
           <w:sz w:val="28"/>
           <w:szCs w:val="28"/>
         </w:rPr>
@@ -1585,6 +1495,7 @@
       </w:pPr>
       <w:r>
         <w:rPr>
+          <w:noProof/>
           <w:sz w:val="28"/>
           <w:szCs w:val="28"/>
         </w:rPr>
@@ -1631,8 +1542,13 @@
         <w:spacing w:after="0"/>
         <w:ind w:left="142"/>
         <w:rPr>
-          <w:sz w:val="28"/>
-          <w:szCs w:val="28"/>
+          <w:rFonts w:eastAsia="Times New Roman" w:cstheme="minorHAnsi"/>
+          <w:color w:val="1D1C1D"/>
+          <w:kern w:val="0"/>
+          <w:sz w:val="28"/>
+          <w:szCs w:val="28"/>
+          <w:lang w:eastAsia="en-IN" w:bidi="ta-IN"/>
+          <w14:ligatures w14:val="none"/>
         </w:rPr>
       </w:pPr>
       <w:r>
@@ -1641,6 +1557,2296 @@
           <w:szCs w:val="28"/>
         </w:rPr>
         <w:t xml:space="preserve">Step 2: </w:t>
+      </w:r>
+      <w:r>
+        <w:rPr>
+          <w:rFonts w:eastAsia="Times New Roman" w:cstheme="minorHAnsi"/>
+          <w:color w:val="1D1C1D"/>
+          <w:kern w:val="0"/>
+          <w:sz w:val="28"/>
+          <w:szCs w:val="28"/>
+          <w:lang w:eastAsia="en-IN" w:bidi="ta-IN"/>
+          <w14:ligatures w14:val="none"/>
+        </w:rPr>
+        <w:t>Goto Manage Jenkins</w:t>
+      </w:r>
+      <w:r>
+        <w:rPr>
+          <w:rFonts w:eastAsia="Times New Roman" w:cstheme="minorHAnsi"/>
+          <w:color w:val="1D1C1D"/>
+          <w:kern w:val="0"/>
+          <w:sz w:val="28"/>
+          <w:szCs w:val="28"/>
+          <w:lang w:eastAsia="en-IN" w:bidi="ta-IN"/>
+          <w14:ligatures w14:val="none"/>
+        </w:rPr>
+        <w:sym w:font="Wingdings" w:char="F0E0"/>
+      </w:r>
+      <w:r>
+        <w:rPr>
+          <w:rFonts w:eastAsia="Times New Roman" w:cstheme="minorHAnsi"/>
+          <w:color w:val="1D1C1D"/>
+          <w:kern w:val="0"/>
+          <w:sz w:val="28"/>
+          <w:szCs w:val="28"/>
+          <w:lang w:eastAsia="en-IN" w:bidi="ta-IN"/>
+          <w14:ligatures w14:val="none"/>
+        </w:rPr>
+        <w:t>security</w:t>
+      </w:r>
+      <w:r>
+        <w:rPr>
+          <w:rFonts w:eastAsia="Times New Roman" w:cstheme="minorHAnsi"/>
+          <w:color w:val="1D1C1D"/>
+          <w:kern w:val="0"/>
+          <w:sz w:val="28"/>
+          <w:szCs w:val="28"/>
+          <w:lang w:eastAsia="en-IN" w:bidi="ta-IN"/>
+          <w14:ligatures w14:val="none"/>
+        </w:rPr>
+        <w:sym w:font="Wingdings" w:char="F0E0"/>
+      </w:r>
+      <w:r>
+        <w:rPr>
+          <w:rFonts w:eastAsia="Times New Roman" w:cstheme="minorHAnsi"/>
+          <w:color w:val="1D1C1D"/>
+          <w:kern w:val="0"/>
+          <w:sz w:val="28"/>
+          <w:szCs w:val="28"/>
+          <w:lang w:eastAsia="en-IN" w:bidi="ta-IN"/>
+          <w14:ligatures w14:val="none"/>
+        </w:rPr>
+        <w:t>select “Project-based matrix Authorization strategy” under Authorization option and add users</w:t>
+      </w:r>
+      <w:r>
+        <w:rPr>
+          <w:rFonts w:eastAsia="Times New Roman" w:cstheme="minorHAnsi"/>
+          <w:color w:val="1D1C1D"/>
+          <w:kern w:val="0"/>
+          <w:sz w:val="28"/>
+          <w:szCs w:val="28"/>
+          <w:lang w:eastAsia="en-IN" w:bidi="ta-IN"/>
+          <w14:ligatures w14:val="none"/>
+        </w:rPr>
+        <w:sym w:font="Wingdings" w:char="F0E0"/>
+      </w:r>
+      <w:r>
+        <w:rPr>
+          <w:rFonts w:eastAsia="Times New Roman" w:cstheme="minorHAnsi"/>
+          <w:color w:val="1D1C1D"/>
+          <w:kern w:val="0"/>
+          <w:sz w:val="28"/>
+          <w:szCs w:val="28"/>
+          <w:lang w:eastAsia="en-IN" w:bidi="ta-IN"/>
+          <w14:ligatures w14:val="none"/>
+        </w:rPr>
+        <w:t>apply &amp; save.</w:t>
+      </w:r>
+    </w:p>
+    <w:p>
+      <w:pPr>
+        <w:spacing w:after="0"/>
+        <w:ind w:left="142"/>
+        <w:rPr>
+          <w:sz w:val="28"/>
+          <w:szCs w:val="28"/>
+        </w:rPr>
+      </w:pPr>
+      <w:r>
+        <w:rPr>
+          <w:sz w:val="28"/>
+          <w:szCs w:val="28"/>
+        </w:rPr>
+        <w:drawing>
+          <wp:inline distT="0" distB="0" distL="0" distR="0" wp14:anchorId="1126B458" wp14:editId="193F3040">
+            <wp:extent cx="7200900" cy="3609975"/>
+            <wp:effectExtent l="0" t="0" r="0" b="9525"/>
+            <wp:docPr id="196194563" name="Picture 1"/>
+            <wp:cNvGraphicFramePr>
+              <a:graphicFrameLocks xmlns:a="http://schemas.openxmlformats.org/drawingml/2006/main" noChangeAspect="1"/>
+            </wp:cNvGraphicFramePr>
+            <a:graphic xmlns:a="http://schemas.openxmlformats.org/drawingml/2006/main">
+              <a:graphicData uri="http://schemas.openxmlformats.org/drawingml/2006/picture">
+                <pic:pic xmlns:pic="http://schemas.openxmlformats.org/drawingml/2006/picture">
+                  <pic:nvPicPr>
+                    <pic:cNvPr id="196194563" name=""/>
+                    <pic:cNvPicPr/>
+                  </pic:nvPicPr>
+                  <pic:blipFill>
+                    <a:blip r:embed="rId22"/>
+                    <a:stretch>
+                      <a:fillRect/>
+                    </a:stretch>
+                  </pic:blipFill>
+                  <pic:spPr>
+                    <a:xfrm>
+                      <a:off x="0" y="0"/>
+                      <a:ext cx="7200900" cy="3609975"/>
+                    </a:xfrm>
+                    <a:prstGeom prst="rect">
+                      <a:avLst/>
+                    </a:prstGeom>
+                  </pic:spPr>
+                </pic:pic>
+              </a:graphicData>
+            </a:graphic>
+          </wp:inline>
+        </w:drawing>
+      </w:r>
+    </w:p>
+    <w:p>
+      <w:pPr>
+        <w:spacing w:after="0"/>
+        <w:ind w:left="142"/>
+        <w:rPr>
+          <w:sz w:val="28"/>
+          <w:szCs w:val="28"/>
+        </w:rPr>
+      </w:pPr>
+    </w:p>
+    <w:p>
+      <w:pPr>
+        <w:pStyle w:val="ListParagraph"/>
+        <w:numPr>
+          <w:ilvl w:val="0"/>
+          <w:numId w:val="2"/>
+        </w:numPr>
+        <w:shd w:val="clear" w:color="auto" w:fill="F8F8F8"/>
+        <w:spacing w:after="0" w:line="240" w:lineRule="auto"/>
+        <w:ind w:left="284" w:hanging="294"/>
+        <w:rPr>
+          <w:rFonts w:eastAsia="Times New Roman" w:cstheme="minorHAnsi"/>
+          <w:color w:val="1D1C1D"/>
+          <w:kern w:val="0"/>
+          <w:sz w:val="36"/>
+          <w:szCs w:val="36"/>
+          <w:lang w:eastAsia="en-IN" w:bidi="ta-IN"/>
+          <w14:ligatures w14:val="none"/>
+        </w:rPr>
+      </w:pPr>
+      <w:r>
+        <w:rPr>
+          <w:rFonts w:eastAsia="Times New Roman" w:cstheme="minorHAnsi"/>
+          <w:color w:val="1D1C1D"/>
+          <w:kern w:val="0"/>
+          <w:sz w:val="36"/>
+          <w:szCs w:val="36"/>
+          <w:lang w:eastAsia="en-IN" w:bidi="ta-IN"/>
+          <w14:ligatures w14:val="none"/>
+        </w:rPr>
+        <w:t>Configure labels and restrict the jobs to execute based on label only.</w:t>
+      </w:r>
+    </w:p>
+    <w:p>
+      <w:pPr>
+        <w:pStyle w:val="ListParagraph"/>
+        <w:shd w:val="clear" w:color="auto" w:fill="F8F8F8"/>
+        <w:spacing w:after="0" w:line="240" w:lineRule="auto"/>
+        <w:ind w:left="284"/>
+        <w:rPr>
+          <w:rFonts w:eastAsia="Times New Roman" w:cstheme="minorHAnsi"/>
+          <w:color w:val="1D1C1D"/>
+          <w:kern w:val="0"/>
+          <w:sz w:val="28"/>
+          <w:szCs w:val="28"/>
+          <w:lang w:eastAsia="en-IN" w:bidi="ta-IN"/>
+          <w14:ligatures w14:val="none"/>
+        </w:rPr>
+      </w:pPr>
+      <w:r>
+        <w:rPr>
+          <w:rFonts w:eastAsia="Times New Roman" w:cstheme="minorHAnsi"/>
+          <w:color w:val="1D1C1D"/>
+          <w:kern w:val="0"/>
+          <w:sz w:val="28"/>
+          <w:szCs w:val="28"/>
+          <w:lang w:eastAsia="en-IN" w:bidi="ta-IN"/>
+          <w14:ligatures w14:val="none"/>
+        </w:rPr>
+        <w:t xml:space="preserve">Step 1: </w:t>
+      </w:r>
+      <w:r>
+        <w:rPr>
+          <w:rFonts w:eastAsia="Times New Roman" w:cstheme="minorHAnsi"/>
+          <w:color w:val="1D1C1D"/>
+          <w:kern w:val="0"/>
+          <w:sz w:val="28"/>
+          <w:szCs w:val="28"/>
+          <w:lang w:eastAsia="en-IN" w:bidi="ta-IN"/>
+          <w14:ligatures w14:val="none"/>
+        </w:rPr>
+        <w:t xml:space="preserve"> </w:t>
+      </w:r>
+      <w:r>
+        <w:rPr>
+          <w:rFonts w:eastAsia="Times New Roman" w:cstheme="minorHAnsi"/>
+          <w:color w:val="1D1C1D"/>
+          <w:kern w:val="0"/>
+          <w:sz w:val="28"/>
+          <w:szCs w:val="28"/>
+          <w:lang w:eastAsia="en-IN" w:bidi="ta-IN"/>
+          <w14:ligatures w14:val="none"/>
+        </w:rPr>
+        <w:t>Goto Manage Jenkins</w:t>
+      </w:r>
+      <w:r>
+        <w:rPr>
+          <w:rFonts w:eastAsia="Times New Roman" w:cstheme="minorHAnsi"/>
+          <w:color w:val="1D1C1D"/>
+          <w:kern w:val="0"/>
+          <w:sz w:val="28"/>
+          <w:szCs w:val="28"/>
+          <w:lang w:eastAsia="en-IN" w:bidi="ta-IN"/>
+          <w14:ligatures w14:val="none"/>
+        </w:rPr>
+        <w:sym w:font="Wingdings" w:char="F0E0"/>
+      </w:r>
+      <w:r>
+        <w:rPr>
+          <w:rFonts w:eastAsia="Times New Roman" w:cstheme="minorHAnsi"/>
+          <w:color w:val="1D1C1D"/>
+          <w:kern w:val="0"/>
+          <w:sz w:val="28"/>
+          <w:szCs w:val="28"/>
+          <w:lang w:eastAsia="en-IN" w:bidi="ta-IN"/>
+          <w14:ligatures w14:val="none"/>
+        </w:rPr>
+        <w:t>system</w:t>
+      </w:r>
+      <w:r>
+        <w:rPr>
+          <w:rFonts w:eastAsia="Times New Roman" w:cstheme="minorHAnsi"/>
+          <w:color w:val="1D1C1D"/>
+          <w:kern w:val="0"/>
+          <w:sz w:val="28"/>
+          <w:szCs w:val="28"/>
+          <w:lang w:eastAsia="en-IN" w:bidi="ta-IN"/>
+          <w14:ligatures w14:val="none"/>
+        </w:rPr>
+        <w:sym w:font="Wingdings" w:char="F0E0"/>
+      </w:r>
+      <w:r>
+        <w:rPr>
+          <w:rFonts w:eastAsia="Times New Roman" w:cstheme="minorHAnsi"/>
+          <w:color w:val="1D1C1D"/>
+          <w:kern w:val="0"/>
+          <w:sz w:val="28"/>
+          <w:szCs w:val="28"/>
+          <w:lang w:eastAsia="en-IN" w:bidi="ta-IN"/>
+          <w14:ligatures w14:val="none"/>
+        </w:rPr>
+        <w:t>give “master” as label name</w:t>
+      </w:r>
+      <w:r>
+        <w:rPr>
+          <w:rFonts w:eastAsia="Times New Roman" w:cstheme="minorHAnsi"/>
+          <w:color w:val="1D1C1D"/>
+          <w:kern w:val="0"/>
+          <w:sz w:val="28"/>
+          <w:szCs w:val="28"/>
+          <w:lang w:eastAsia="en-IN" w:bidi="ta-IN"/>
+          <w14:ligatures w14:val="none"/>
+        </w:rPr>
+        <w:sym w:font="Wingdings" w:char="F0E0"/>
+      </w:r>
+      <w:r>
+        <w:rPr>
+          <w:rFonts w:eastAsia="Times New Roman" w:cstheme="minorHAnsi"/>
+          <w:color w:val="1D1C1D"/>
+          <w:kern w:val="0"/>
+          <w:sz w:val="28"/>
+          <w:szCs w:val="28"/>
+          <w:lang w:eastAsia="en-IN" w:bidi="ta-IN"/>
+          <w14:ligatures w14:val="none"/>
+        </w:rPr>
+        <w:t xml:space="preserve"> apply &amp; save.</w:t>
+      </w:r>
+    </w:p>
+    <w:p>
+      <w:pPr>
+        <w:pStyle w:val="ListParagraph"/>
+        <w:shd w:val="clear" w:color="auto" w:fill="F8F8F8"/>
+        <w:spacing w:after="0" w:line="240" w:lineRule="auto"/>
+        <w:ind w:left="284"/>
+        <w:rPr>
+          <w:rFonts w:eastAsia="Times New Roman" w:cstheme="minorHAnsi"/>
+          <w:color w:val="1D1C1D"/>
+          <w:kern w:val="0"/>
+          <w:sz w:val="28"/>
+          <w:szCs w:val="28"/>
+          <w:lang w:eastAsia="en-IN" w:bidi="ta-IN"/>
+          <w14:ligatures w14:val="none"/>
+        </w:rPr>
+      </w:pPr>
+      <w:r>
+        <w:rPr>
+          <w:rFonts w:eastAsia="Times New Roman" w:cstheme="minorHAnsi"/>
+          <w:color w:val="1D1C1D"/>
+          <w:kern w:val="0"/>
+          <w:sz w:val="28"/>
+          <w:szCs w:val="28"/>
+          <w:lang w:eastAsia="en-IN" w:bidi="ta-IN"/>
+          <w14:ligatures w14:val="none"/>
+        </w:rPr>
+        <w:drawing>
+          <wp:inline distT="0" distB="0" distL="0" distR="0" wp14:anchorId="7ED21C9D" wp14:editId="2584C77E">
+            <wp:extent cx="7200900" cy="3648075"/>
+            <wp:effectExtent l="0" t="0" r="0" b="9525"/>
+            <wp:docPr id="52203473" name="Picture 1"/>
+            <wp:cNvGraphicFramePr>
+              <a:graphicFrameLocks xmlns:a="http://schemas.openxmlformats.org/drawingml/2006/main" noChangeAspect="1"/>
+            </wp:cNvGraphicFramePr>
+            <a:graphic xmlns:a="http://schemas.openxmlformats.org/drawingml/2006/main">
+              <a:graphicData uri="http://schemas.openxmlformats.org/drawingml/2006/picture">
+                <pic:pic xmlns:pic="http://schemas.openxmlformats.org/drawingml/2006/picture">
+                  <pic:nvPicPr>
+                    <pic:cNvPr id="52203473" name=""/>
+                    <pic:cNvPicPr/>
+                  </pic:nvPicPr>
+                  <pic:blipFill>
+                    <a:blip r:embed="rId23"/>
+                    <a:stretch>
+                      <a:fillRect/>
+                    </a:stretch>
+                  </pic:blipFill>
+                  <pic:spPr>
+                    <a:xfrm>
+                      <a:off x="0" y="0"/>
+                      <a:ext cx="7200900" cy="3648075"/>
+                    </a:xfrm>
+                    <a:prstGeom prst="rect">
+                      <a:avLst/>
+                    </a:prstGeom>
+                  </pic:spPr>
+                </pic:pic>
+              </a:graphicData>
+            </a:graphic>
+          </wp:inline>
+        </w:drawing>
+      </w:r>
+    </w:p>
+    <w:p>
+      <w:pPr>
+        <w:pStyle w:val="ListParagraph"/>
+        <w:shd w:val="clear" w:color="auto" w:fill="F8F8F8"/>
+        <w:spacing w:after="0" w:line="240" w:lineRule="auto"/>
+        <w:ind w:left="284"/>
+        <w:rPr>
+          <w:rFonts w:eastAsia="Times New Roman" w:cstheme="minorHAnsi"/>
+          <w:color w:val="1D1C1D"/>
+          <w:kern w:val="0"/>
+          <w:sz w:val="28"/>
+          <w:szCs w:val="28"/>
+          <w:lang w:eastAsia="en-IN" w:bidi="ta-IN"/>
+          <w14:ligatures w14:val="none"/>
+        </w:rPr>
+      </w:pPr>
+      <w:r>
+        <w:rPr>
+          <w:rFonts w:eastAsia="Times New Roman" w:cstheme="minorHAnsi"/>
+          <w:color w:val="1D1C1D"/>
+          <w:kern w:val="0"/>
+          <w:sz w:val="28"/>
+          <w:szCs w:val="28"/>
+          <w:lang w:eastAsia="en-IN" w:bidi="ta-IN"/>
+          <w14:ligatures w14:val="none"/>
+        </w:rPr>
+        <w:lastRenderedPageBreak/>
+        <w:t>Step 2: Goto Manage Jenkins</w:t>
+      </w:r>
+      <w:r>
+        <w:rPr>
+          <w:rFonts w:eastAsia="Times New Roman" w:cstheme="minorHAnsi"/>
+          <w:color w:val="1D1C1D"/>
+          <w:kern w:val="0"/>
+          <w:sz w:val="28"/>
+          <w:szCs w:val="28"/>
+          <w:lang w:eastAsia="en-IN" w:bidi="ta-IN"/>
+          <w14:ligatures w14:val="none"/>
+        </w:rPr>
+        <w:sym w:font="Wingdings" w:char="F0E0"/>
+      </w:r>
+      <w:r>
+        <w:rPr>
+          <w:rFonts w:eastAsia="Times New Roman" w:cstheme="minorHAnsi"/>
+          <w:color w:val="1D1C1D"/>
+          <w:kern w:val="0"/>
+          <w:sz w:val="28"/>
+          <w:szCs w:val="28"/>
+          <w:lang w:eastAsia="en-IN" w:bidi="ta-IN"/>
+          <w14:ligatures w14:val="none"/>
+        </w:rPr>
+        <w:t>plugins</w:t>
+      </w:r>
+      <w:r>
+        <w:rPr>
+          <w:rFonts w:eastAsia="Times New Roman" w:cstheme="minorHAnsi"/>
+          <w:color w:val="1D1C1D"/>
+          <w:kern w:val="0"/>
+          <w:sz w:val="28"/>
+          <w:szCs w:val="28"/>
+          <w:lang w:eastAsia="en-IN" w:bidi="ta-IN"/>
+          <w14:ligatures w14:val="none"/>
+        </w:rPr>
+        <w:sym w:font="Wingdings" w:char="F0E0"/>
+      </w:r>
+      <w:r>
+        <w:rPr>
+          <w:rFonts w:eastAsia="Times New Roman" w:cstheme="minorHAnsi"/>
+          <w:color w:val="1D1C1D"/>
+          <w:kern w:val="0"/>
+          <w:sz w:val="28"/>
+          <w:szCs w:val="28"/>
+          <w:lang w:eastAsia="en-IN" w:bidi="ta-IN"/>
+          <w14:ligatures w14:val="none"/>
+        </w:rPr>
+        <w:t>Available plugins</w:t>
+      </w:r>
+      <w:r>
+        <w:rPr>
+          <w:rFonts w:eastAsia="Times New Roman" w:cstheme="minorHAnsi"/>
+          <w:color w:val="1D1C1D"/>
+          <w:kern w:val="0"/>
+          <w:sz w:val="28"/>
+          <w:szCs w:val="28"/>
+          <w:lang w:eastAsia="en-IN" w:bidi="ta-IN"/>
+          <w14:ligatures w14:val="none"/>
+        </w:rPr>
+        <w:sym w:font="Wingdings" w:char="F0E0"/>
+      </w:r>
+      <w:r>
+        <w:rPr>
+          <w:rFonts w:eastAsia="Times New Roman" w:cstheme="minorHAnsi"/>
+          <w:color w:val="1D1C1D"/>
+          <w:kern w:val="0"/>
+          <w:sz w:val="28"/>
+          <w:szCs w:val="28"/>
+          <w:lang w:eastAsia="en-IN" w:bidi="ta-IN"/>
+          <w14:ligatures w14:val="none"/>
+        </w:rPr>
+        <w:t>se</w:t>
+      </w:r>
+      <w:r>
+        <w:rPr>
+          <w:rFonts w:eastAsia="Times New Roman" w:cstheme="minorHAnsi"/>
+          <w:color w:val="1D1C1D"/>
+          <w:kern w:val="0"/>
+          <w:sz w:val="28"/>
+          <w:szCs w:val="28"/>
+          <w:lang w:eastAsia="en-IN" w:bidi="ta-IN"/>
+          <w14:ligatures w14:val="none"/>
+        </w:rPr>
+        <w:t>lect Node and label parameter and install it.</w:t>
+      </w:r>
+    </w:p>
+    <w:p>
+      <w:pPr>
+        <w:pStyle w:val="ListParagraph"/>
+        <w:shd w:val="clear" w:color="auto" w:fill="F8F8F8"/>
+        <w:spacing w:after="0" w:line="240" w:lineRule="auto"/>
+        <w:ind w:left="284"/>
+        <w:rPr>
+          <w:rFonts w:eastAsia="Times New Roman" w:cstheme="minorHAnsi"/>
+          <w:color w:val="1D1C1D"/>
+          <w:kern w:val="0"/>
+          <w:sz w:val="28"/>
+          <w:szCs w:val="28"/>
+          <w:lang w:eastAsia="en-IN" w:bidi="ta-IN"/>
+          <w14:ligatures w14:val="none"/>
+        </w:rPr>
+      </w:pPr>
+      <w:r>
+        <w:rPr>
+          <w:rFonts w:eastAsia="Times New Roman" w:cstheme="minorHAnsi"/>
+          <w:color w:val="1D1C1D"/>
+          <w:kern w:val="0"/>
+          <w:sz w:val="28"/>
+          <w:szCs w:val="28"/>
+          <w:lang w:eastAsia="en-IN" w:bidi="ta-IN"/>
+          <w14:ligatures w14:val="none"/>
+        </w:rPr>
+        <w:drawing>
+          <wp:inline distT="0" distB="0" distL="0" distR="0" wp14:anchorId="0A828A33" wp14:editId="49F7B676">
+            <wp:extent cx="7200900" cy="1710690"/>
+            <wp:effectExtent l="0" t="0" r="0" b="3810"/>
+            <wp:docPr id="75894054" name="Picture 1"/>
+            <wp:cNvGraphicFramePr>
+              <a:graphicFrameLocks xmlns:a="http://schemas.openxmlformats.org/drawingml/2006/main" noChangeAspect="1"/>
+            </wp:cNvGraphicFramePr>
+            <a:graphic xmlns:a="http://schemas.openxmlformats.org/drawingml/2006/main">
+              <a:graphicData uri="http://schemas.openxmlformats.org/drawingml/2006/picture">
+                <pic:pic xmlns:pic="http://schemas.openxmlformats.org/drawingml/2006/picture">
+                  <pic:nvPicPr>
+                    <pic:cNvPr id="75894054" name=""/>
+                    <pic:cNvPicPr/>
+                  </pic:nvPicPr>
+                  <pic:blipFill>
+                    <a:blip r:embed="rId24"/>
+                    <a:stretch>
+                      <a:fillRect/>
+                    </a:stretch>
+                  </pic:blipFill>
+                  <pic:spPr>
+                    <a:xfrm>
+                      <a:off x="0" y="0"/>
+                      <a:ext cx="7200900" cy="1710690"/>
+                    </a:xfrm>
+                    <a:prstGeom prst="rect">
+                      <a:avLst/>
+                    </a:prstGeom>
+                  </pic:spPr>
+                </pic:pic>
+              </a:graphicData>
+            </a:graphic>
+          </wp:inline>
+        </w:drawing>
+      </w:r>
+    </w:p>
+    <w:p>
+      <w:pPr>
+        <w:pStyle w:val="ListParagraph"/>
+        <w:shd w:val="clear" w:color="auto" w:fill="F8F8F8"/>
+        <w:spacing w:after="0" w:line="240" w:lineRule="auto"/>
+        <w:ind w:left="284"/>
+        <w:rPr>
+          <w:rFonts w:eastAsia="Times New Roman" w:cstheme="minorHAnsi"/>
+          <w:color w:val="1D1C1D"/>
+          <w:kern w:val="0"/>
+          <w:sz w:val="28"/>
+          <w:szCs w:val="28"/>
+          <w:lang w:eastAsia="en-IN" w:bidi="ta-IN"/>
+          <w14:ligatures w14:val="none"/>
+        </w:rPr>
+      </w:pPr>
+      <w:r>
+        <w:rPr>
+          <w:rFonts w:eastAsia="Times New Roman" w:cstheme="minorHAnsi"/>
+          <w:color w:val="1D1C1D"/>
+          <w:kern w:val="0"/>
+          <w:sz w:val="28"/>
+          <w:szCs w:val="28"/>
+          <w:lang w:eastAsia="en-IN" w:bidi="ta-IN"/>
+          <w14:ligatures w14:val="none"/>
+        </w:rPr>
+        <w:drawing>
+          <wp:inline distT="0" distB="0" distL="0" distR="0" wp14:anchorId="3D6451FF" wp14:editId="37E34B87">
+            <wp:extent cx="7200900" cy="2016760"/>
+            <wp:effectExtent l="0" t="0" r="0" b="2540"/>
+            <wp:docPr id="1962838294" name="Picture 1"/>
+            <wp:cNvGraphicFramePr>
+              <a:graphicFrameLocks xmlns:a="http://schemas.openxmlformats.org/drawingml/2006/main" noChangeAspect="1"/>
+            </wp:cNvGraphicFramePr>
+            <a:graphic xmlns:a="http://schemas.openxmlformats.org/drawingml/2006/main">
+              <a:graphicData uri="http://schemas.openxmlformats.org/drawingml/2006/picture">
+                <pic:pic xmlns:pic="http://schemas.openxmlformats.org/drawingml/2006/picture">
+                  <pic:nvPicPr>
+                    <pic:cNvPr id="1962838294" name=""/>
+                    <pic:cNvPicPr/>
+                  </pic:nvPicPr>
+                  <pic:blipFill>
+                    <a:blip r:embed="rId25"/>
+                    <a:stretch>
+                      <a:fillRect/>
+                    </a:stretch>
+                  </pic:blipFill>
+                  <pic:spPr>
+                    <a:xfrm>
+                      <a:off x="0" y="0"/>
+                      <a:ext cx="7200900" cy="2016760"/>
+                    </a:xfrm>
+                    <a:prstGeom prst="rect">
+                      <a:avLst/>
+                    </a:prstGeom>
+                  </pic:spPr>
+                </pic:pic>
+              </a:graphicData>
+            </a:graphic>
+          </wp:inline>
+        </w:drawing>
+      </w:r>
+    </w:p>
+    <w:p>
+      <w:pPr>
+        <w:pStyle w:val="ListParagraph"/>
+        <w:shd w:val="clear" w:color="auto" w:fill="F8F8F8"/>
+        <w:spacing w:after="0" w:line="240" w:lineRule="auto"/>
+        <w:ind w:left="284"/>
+        <w:rPr>
+          <w:rFonts w:eastAsia="Times New Roman" w:cstheme="minorHAnsi"/>
+          <w:color w:val="1D1C1D"/>
+          <w:kern w:val="0"/>
+          <w:sz w:val="28"/>
+          <w:szCs w:val="28"/>
+          <w:lang w:eastAsia="en-IN" w:bidi="ta-IN"/>
+          <w14:ligatures w14:val="none"/>
+        </w:rPr>
+      </w:pPr>
+      <w:r>
+        <w:rPr>
+          <w:rFonts w:eastAsia="Times New Roman" w:cstheme="minorHAnsi"/>
+          <w:color w:val="1D1C1D"/>
+          <w:kern w:val="0"/>
+          <w:sz w:val="28"/>
+          <w:szCs w:val="28"/>
+          <w:lang w:eastAsia="en-IN" w:bidi="ta-IN"/>
+          <w14:ligatures w14:val="none"/>
+        </w:rPr>
+        <w:t>Step 3: Select a job and select label expression and save it.</w:t>
+      </w:r>
+    </w:p>
+    <w:p>
+      <w:pPr>
+        <w:pStyle w:val="ListParagraph"/>
+        <w:shd w:val="clear" w:color="auto" w:fill="F8F8F8"/>
+        <w:spacing w:after="0" w:line="240" w:lineRule="auto"/>
+        <w:ind w:left="284"/>
+        <w:rPr>
+          <w:rFonts w:eastAsia="Times New Roman" w:cstheme="minorHAnsi"/>
+          <w:color w:val="1D1C1D"/>
+          <w:kern w:val="0"/>
+          <w:sz w:val="28"/>
+          <w:szCs w:val="28"/>
+          <w:lang w:eastAsia="en-IN" w:bidi="ta-IN"/>
+          <w14:ligatures w14:val="none"/>
+        </w:rPr>
+      </w:pPr>
+      <w:r>
+        <w:rPr>
+          <w:rFonts w:eastAsia="Times New Roman" w:cstheme="minorHAnsi"/>
+          <w:color w:val="1D1C1D"/>
+          <w:kern w:val="0"/>
+          <w:sz w:val="28"/>
+          <w:szCs w:val="28"/>
+          <w:lang w:eastAsia="en-IN" w:bidi="ta-IN"/>
+          <w14:ligatures w14:val="none"/>
+        </w:rPr>
+        <w:drawing>
+          <wp:inline distT="0" distB="0" distL="0" distR="0" wp14:anchorId="46CC2042" wp14:editId="6AB2ED9D">
+            <wp:extent cx="7200900" cy="3482340"/>
+            <wp:effectExtent l="0" t="0" r="0" b="3810"/>
+            <wp:docPr id="10772491" name="Picture 1"/>
+            <wp:cNvGraphicFramePr>
+              <a:graphicFrameLocks xmlns:a="http://schemas.openxmlformats.org/drawingml/2006/main" noChangeAspect="1"/>
+            </wp:cNvGraphicFramePr>
+            <a:graphic xmlns:a="http://schemas.openxmlformats.org/drawingml/2006/main">
+              <a:graphicData uri="http://schemas.openxmlformats.org/drawingml/2006/picture">
+                <pic:pic xmlns:pic="http://schemas.openxmlformats.org/drawingml/2006/picture">
+                  <pic:nvPicPr>
+                    <pic:cNvPr id="10772491" name=""/>
+                    <pic:cNvPicPr/>
+                  </pic:nvPicPr>
+                  <pic:blipFill>
+                    <a:blip r:embed="rId26"/>
+                    <a:stretch>
+                      <a:fillRect/>
+                    </a:stretch>
+                  </pic:blipFill>
+                  <pic:spPr>
+                    <a:xfrm>
+                      <a:off x="0" y="0"/>
+                      <a:ext cx="7200900" cy="3482340"/>
+                    </a:xfrm>
+                    <a:prstGeom prst="rect">
+                      <a:avLst/>
+                    </a:prstGeom>
+                  </pic:spPr>
+                </pic:pic>
+              </a:graphicData>
+            </a:graphic>
+          </wp:inline>
+        </w:drawing>
+      </w:r>
+    </w:p>
+    <w:p>
+      <w:pPr>
+        <w:spacing w:after="0"/>
+        <w:ind w:left="142"/>
+        <w:rPr>
+          <w:sz w:val="28"/>
+          <w:szCs w:val="28"/>
+        </w:rPr>
+      </w:pPr>
+    </w:p>
+    <w:p>
+      <w:pPr>
+        <w:spacing w:after="0"/>
+        <w:ind w:left="142"/>
+        <w:rPr>
+          <w:sz w:val="28"/>
+          <w:szCs w:val="28"/>
+        </w:rPr>
+      </w:pPr>
+    </w:p>
+    <w:p>
+      <w:pPr>
+        <w:spacing w:after="0"/>
+        <w:ind w:left="142"/>
+        <w:rPr>
+          <w:sz w:val="28"/>
+          <w:szCs w:val="28"/>
+        </w:rPr>
+      </w:pPr>
+    </w:p>
+    <w:p>
+      <w:pPr>
+        <w:spacing w:after="0"/>
+        <w:ind w:left="142"/>
+        <w:rPr>
+          <w:sz w:val="28"/>
+          <w:szCs w:val="28"/>
+        </w:rPr>
+      </w:pPr>
+    </w:p>
+    <w:p>
+      <w:pPr>
+        <w:spacing w:after="0"/>
+        <w:ind w:left="142"/>
+        <w:rPr>
+          <w:sz w:val="28"/>
+          <w:szCs w:val="28"/>
+        </w:rPr>
+      </w:pPr>
+    </w:p>
+    <w:p>
+      <w:pPr>
+        <w:spacing w:after="0"/>
+        <w:ind w:left="142"/>
+        <w:rPr>
+          <w:sz w:val="28"/>
+          <w:szCs w:val="28"/>
+        </w:rPr>
+      </w:pPr>
+    </w:p>
+    <w:p>
+      <w:pPr>
+        <w:spacing w:after="0"/>
+        <w:ind w:left="142"/>
+        <w:rPr>
+          <w:sz w:val="28"/>
+          <w:szCs w:val="28"/>
+        </w:rPr>
+      </w:pPr>
+    </w:p>
+    <w:p>
+      <w:pPr>
+        <w:spacing w:after="0"/>
+        <w:ind w:left="142"/>
+        <w:rPr>
+          <w:sz w:val="28"/>
+          <w:szCs w:val="28"/>
+        </w:rPr>
+      </w:pPr>
+    </w:p>
+    <w:p>
+      <w:pPr>
+        <w:spacing w:after="0"/>
+        <w:ind w:left="142"/>
+        <w:rPr>
+          <w:sz w:val="28"/>
+          <w:szCs w:val="28"/>
+        </w:rPr>
+      </w:pPr>
+    </w:p>
+    <w:p>
+      <w:pPr>
+        <w:spacing w:after="0"/>
+        <w:ind w:left="142"/>
+        <w:rPr>
+          <w:sz w:val="28"/>
+          <w:szCs w:val="28"/>
+        </w:rPr>
+      </w:pPr>
+    </w:p>
+    <w:p>
+      <w:pPr>
+        <w:pStyle w:val="ListParagraph"/>
+        <w:numPr>
+          <w:ilvl w:val="0"/>
+          <w:numId w:val="2"/>
+        </w:numPr>
+        <w:shd w:val="clear" w:color="auto" w:fill="F8F8F8"/>
+        <w:spacing w:before="100" w:beforeAutospacing="1" w:after="0" w:line="240" w:lineRule="auto"/>
+        <w:ind w:left="284" w:hanging="294"/>
+        <w:rPr>
+          <w:rFonts w:eastAsia="Times New Roman" w:cstheme="minorHAnsi"/>
+          <w:color w:val="1D1C1D"/>
+          <w:kern w:val="0"/>
+          <w:sz w:val="36"/>
+          <w:szCs w:val="36"/>
+          <w:lang w:eastAsia="en-IN" w:bidi="ta-IN"/>
+          <w14:ligatures w14:val="none"/>
+        </w:rPr>
+      </w:pPr>
+      <w:r>
+        <w:rPr>
+          <w:rFonts w:eastAsia="Times New Roman" w:cstheme="minorHAnsi"/>
+          <w:color w:val="1D1C1D"/>
+          <w:kern w:val="0"/>
+          <w:sz w:val="36"/>
+          <w:szCs w:val="36"/>
+          <w:lang w:eastAsia="en-IN" w:bidi="ta-IN"/>
+          <w14:ligatures w14:val="none"/>
+        </w:rPr>
+        <w:lastRenderedPageBreak/>
+        <w:t>Create Three sample jobs using the below</w:t>
+      </w:r>
+      <w:r>
+        <w:rPr>
+          <w:rFonts w:eastAsia="Times New Roman" w:cstheme="minorHAnsi"/>
+          <w:color w:val="1D1C1D"/>
+          <w:kern w:val="0"/>
+          <w:sz w:val="36"/>
+          <w:szCs w:val="36"/>
+          <w:lang w:eastAsia="en-IN" w:bidi="ta-IN"/>
+          <w14:ligatures w14:val="none"/>
+        </w:rPr>
+        <w:t xml:space="preserve"> </w:t>
+      </w:r>
+      <w:r>
+        <w:rPr>
+          <w:rFonts w:eastAsia="Times New Roman" w:cstheme="minorHAnsi"/>
+          <w:color w:val="1D1C1D"/>
+          <w:kern w:val="0"/>
+          <w:sz w:val="36"/>
+          <w:szCs w:val="36"/>
+          <w:lang w:eastAsia="en-IN" w:bidi="ta-IN"/>
+          <w14:ligatures w14:val="none"/>
+        </w:rPr>
+        <w:t>URL. </w:t>
+      </w:r>
+      <w:hyperlink r:id="rId27" w:history="1">
+        <w:r>
+          <w:rPr>
+            <w:rStyle w:val="Hyperlink"/>
+            <w:rFonts w:eastAsia="Times New Roman" w:cstheme="minorHAnsi"/>
+            <w:kern w:val="0"/>
+            <w:sz w:val="36"/>
+            <w:szCs w:val="36"/>
+            <w:lang w:eastAsia="en-IN" w:bidi="ta-IN"/>
+            <w14:ligatures w14:val="none"/>
+          </w:rPr>
+          <w:t>https://github.com/betawins/Techie_horizon_Login_app.git</w:t>
+        </w:r>
+      </w:hyperlink>
+      <w:r>
+        <w:rPr>
+          <w:rFonts w:eastAsia="Times New Roman" w:cstheme="minorHAnsi"/>
+          <w:color w:val="1264A3"/>
+          <w:kern w:val="0"/>
+          <w:sz w:val="36"/>
+          <w:szCs w:val="36"/>
+          <w:u w:val="single"/>
+          <w:lang w:eastAsia="en-IN" w:bidi="ta-IN"/>
+          <w14:ligatures w14:val="none"/>
+        </w:rPr>
+        <w:t xml:space="preserve"> </w:t>
+      </w:r>
+    </w:p>
+    <w:p>
+      <w:pPr>
+        <w:pStyle w:val="ListParagraph"/>
+        <w:shd w:val="clear" w:color="auto" w:fill="F8F8F8"/>
+        <w:spacing w:before="100" w:beforeAutospacing="1" w:after="0" w:line="240" w:lineRule="auto"/>
+        <w:ind w:left="284"/>
+        <w:rPr>
+          <w:rFonts w:eastAsia="Times New Roman" w:cstheme="minorHAnsi"/>
+          <w:color w:val="1D1C1D"/>
+          <w:kern w:val="0"/>
+          <w:sz w:val="28"/>
+          <w:szCs w:val="28"/>
+          <w:lang w:eastAsia="en-IN" w:bidi="ta-IN"/>
+          <w14:ligatures w14:val="none"/>
+        </w:rPr>
+      </w:pPr>
+      <w:r>
+        <w:rPr>
+          <w:rFonts w:eastAsia="Times New Roman" w:cstheme="minorHAnsi"/>
+          <w:color w:val="1D1C1D"/>
+          <w:kern w:val="0"/>
+          <w:sz w:val="28"/>
+          <w:szCs w:val="28"/>
+          <w:lang w:eastAsia="en-IN" w:bidi="ta-IN"/>
+          <w14:ligatures w14:val="none"/>
+        </w:rPr>
+        <w:t>Step 1: Install git in EC2 instance.</w:t>
+      </w:r>
+    </w:p>
+    <w:p>
+      <w:pPr>
+        <w:pStyle w:val="ListParagraph"/>
+        <w:shd w:val="clear" w:color="auto" w:fill="F8F8F8"/>
+        <w:spacing w:before="100" w:beforeAutospacing="1" w:after="0" w:line="240" w:lineRule="auto"/>
+        <w:ind w:left="284"/>
+        <w:rPr>
+          <w:rFonts w:eastAsia="Times New Roman" w:cstheme="minorHAnsi"/>
+          <w:color w:val="1D1C1D"/>
+          <w:kern w:val="0"/>
+          <w:sz w:val="28"/>
+          <w:szCs w:val="28"/>
+          <w:lang w:eastAsia="en-IN" w:bidi="ta-IN"/>
+          <w14:ligatures w14:val="none"/>
+        </w:rPr>
+      </w:pPr>
+      <w:r>
+        <w:rPr>
+          <w:rFonts w:eastAsia="Times New Roman" w:cstheme="minorHAnsi"/>
+          <w:color w:val="1D1C1D"/>
+          <w:kern w:val="0"/>
+          <w:sz w:val="28"/>
+          <w:szCs w:val="28"/>
+          <w:lang w:eastAsia="en-IN" w:bidi="ta-IN"/>
+          <w14:ligatures w14:val="none"/>
+        </w:rPr>
+        <w:drawing>
+          <wp:inline distT="0" distB="0" distL="0" distR="0" wp14:anchorId="38B4E84D" wp14:editId="3DD683A8">
+            <wp:extent cx="7200900" cy="1804670"/>
+            <wp:effectExtent l="0" t="0" r="0" b="5080"/>
+            <wp:docPr id="322736311" name="Picture 1"/>
+            <wp:cNvGraphicFramePr>
+              <a:graphicFrameLocks xmlns:a="http://schemas.openxmlformats.org/drawingml/2006/main" noChangeAspect="1"/>
+            </wp:cNvGraphicFramePr>
+            <a:graphic xmlns:a="http://schemas.openxmlformats.org/drawingml/2006/main">
+              <a:graphicData uri="http://schemas.openxmlformats.org/drawingml/2006/picture">
+                <pic:pic xmlns:pic="http://schemas.openxmlformats.org/drawingml/2006/picture">
+                  <pic:nvPicPr>
+                    <pic:cNvPr id="322736311" name=""/>
+                    <pic:cNvPicPr/>
+                  </pic:nvPicPr>
+                  <pic:blipFill>
+                    <a:blip r:embed="rId28"/>
+                    <a:stretch>
+                      <a:fillRect/>
+                    </a:stretch>
+                  </pic:blipFill>
+                  <pic:spPr>
+                    <a:xfrm>
+                      <a:off x="0" y="0"/>
+                      <a:ext cx="7200900" cy="1804670"/>
+                    </a:xfrm>
+                    <a:prstGeom prst="rect">
+                      <a:avLst/>
+                    </a:prstGeom>
+                  </pic:spPr>
+                </pic:pic>
+              </a:graphicData>
+            </a:graphic>
+          </wp:inline>
+        </w:drawing>
+      </w:r>
+    </w:p>
+    <w:p>
+      <w:pPr>
+        <w:pStyle w:val="ListParagraph"/>
+        <w:shd w:val="clear" w:color="auto" w:fill="F8F8F8"/>
+        <w:spacing w:before="100" w:beforeAutospacing="1" w:after="0" w:line="240" w:lineRule="auto"/>
+        <w:ind w:left="284"/>
+        <w:rPr>
+          <w:rFonts w:eastAsia="Times New Roman" w:cstheme="minorHAnsi"/>
+          <w:color w:val="1D1C1D"/>
+          <w:kern w:val="0"/>
+          <w:sz w:val="28"/>
+          <w:szCs w:val="28"/>
+          <w:lang w:eastAsia="en-IN" w:bidi="ta-IN"/>
+          <w14:ligatures w14:val="none"/>
+        </w:rPr>
+      </w:pPr>
+      <w:r>
+        <w:rPr>
+          <w:rFonts w:eastAsia="Times New Roman" w:cstheme="minorHAnsi"/>
+          <w:color w:val="1D1C1D"/>
+          <w:kern w:val="0"/>
+          <w:sz w:val="28"/>
+          <w:szCs w:val="28"/>
+          <w:lang w:eastAsia="en-IN" w:bidi="ta-IN"/>
+          <w14:ligatures w14:val="none"/>
+        </w:rPr>
+        <w:t xml:space="preserve">Step </w:t>
+      </w:r>
+      <w:r>
+        <w:rPr>
+          <w:rFonts w:eastAsia="Times New Roman" w:cstheme="minorHAnsi"/>
+          <w:color w:val="1D1C1D"/>
+          <w:kern w:val="0"/>
+          <w:sz w:val="28"/>
+          <w:szCs w:val="28"/>
+          <w:lang w:eastAsia="en-IN" w:bidi="ta-IN"/>
+          <w14:ligatures w14:val="none"/>
+        </w:rPr>
+        <w:t>2</w:t>
+      </w:r>
+      <w:r>
+        <w:rPr>
+          <w:rFonts w:eastAsia="Times New Roman" w:cstheme="minorHAnsi"/>
+          <w:color w:val="1D1C1D"/>
+          <w:kern w:val="0"/>
+          <w:sz w:val="28"/>
+          <w:szCs w:val="28"/>
+          <w:lang w:eastAsia="en-IN" w:bidi="ta-IN"/>
+          <w14:ligatures w14:val="none"/>
+        </w:rPr>
+        <w:t xml:space="preserve">: </w:t>
+      </w:r>
+      <w:r>
+        <w:rPr>
+          <w:rFonts w:eastAsia="Times New Roman" w:cstheme="minorHAnsi"/>
+          <w:color w:val="1D1C1D"/>
+          <w:kern w:val="0"/>
+          <w:sz w:val="28"/>
+          <w:szCs w:val="28"/>
+          <w:lang w:eastAsia="en-IN" w:bidi="ta-IN"/>
+          <w14:ligatures w14:val="none"/>
+        </w:rPr>
+        <w:t>Create a job</w:t>
+      </w:r>
+      <w:r>
+        <w:rPr>
+          <w:rFonts w:eastAsia="Times New Roman" w:cstheme="minorHAnsi"/>
+          <w:color w:val="1D1C1D"/>
+          <w:kern w:val="0"/>
+          <w:sz w:val="28"/>
+          <w:szCs w:val="28"/>
+          <w:lang w:eastAsia="en-IN" w:bidi="ta-IN"/>
+          <w14:ligatures w14:val="none"/>
+        </w:rPr>
+        <w:sym w:font="Wingdings" w:char="F0E0"/>
+      </w:r>
+      <w:r>
+        <w:rPr>
+          <w:rFonts w:eastAsia="Times New Roman" w:cstheme="minorHAnsi"/>
+          <w:color w:val="1D1C1D"/>
+          <w:kern w:val="0"/>
+          <w:sz w:val="28"/>
+          <w:szCs w:val="28"/>
+          <w:lang w:eastAsia="en-IN" w:bidi="ta-IN"/>
+          <w14:ligatures w14:val="none"/>
+        </w:rPr>
+        <w:t>give description</w:t>
+      </w:r>
+      <w:r>
+        <w:rPr>
+          <w:rFonts w:eastAsia="Times New Roman" w:cstheme="minorHAnsi"/>
+          <w:color w:val="1D1C1D"/>
+          <w:kern w:val="0"/>
+          <w:sz w:val="28"/>
+          <w:szCs w:val="28"/>
+          <w:lang w:eastAsia="en-IN" w:bidi="ta-IN"/>
+          <w14:ligatures w14:val="none"/>
+        </w:rPr>
+        <w:sym w:font="Wingdings" w:char="F0E0"/>
+      </w:r>
+      <w:r>
+        <w:rPr>
+          <w:rFonts w:eastAsia="Times New Roman" w:cstheme="minorHAnsi"/>
+          <w:color w:val="1D1C1D"/>
+          <w:kern w:val="0"/>
+          <w:sz w:val="28"/>
+          <w:szCs w:val="28"/>
+          <w:lang w:eastAsia="en-IN" w:bidi="ta-IN"/>
+          <w14:ligatures w14:val="none"/>
+        </w:rPr>
+        <w:t>select Git and paste repo link</w:t>
+      </w:r>
+      <w:r>
+        <w:rPr>
+          <w:rFonts w:eastAsia="Times New Roman" w:cstheme="minorHAnsi"/>
+          <w:color w:val="1D1C1D"/>
+          <w:kern w:val="0"/>
+          <w:sz w:val="28"/>
+          <w:szCs w:val="28"/>
+          <w:lang w:eastAsia="en-IN" w:bidi="ta-IN"/>
+          <w14:ligatures w14:val="none"/>
+        </w:rPr>
+        <w:sym w:font="Wingdings" w:char="F0E0"/>
+      </w:r>
+      <w:r>
+        <w:rPr>
+          <w:rFonts w:eastAsia="Times New Roman" w:cstheme="minorHAnsi"/>
+          <w:color w:val="1D1C1D"/>
+          <w:kern w:val="0"/>
+          <w:sz w:val="28"/>
+          <w:szCs w:val="28"/>
+          <w:lang w:eastAsia="en-IN" w:bidi="ta-IN"/>
+          <w14:ligatures w14:val="none"/>
+        </w:rPr>
+        <w:t>apply&amp;save.</w:t>
+      </w:r>
+    </w:p>
+    <w:p>
+      <w:pPr>
+        <w:pStyle w:val="ListParagraph"/>
+        <w:shd w:val="clear" w:color="auto" w:fill="F8F8F8"/>
+        <w:spacing w:before="100" w:beforeAutospacing="1" w:after="0" w:line="240" w:lineRule="auto"/>
+        <w:ind w:left="284"/>
+        <w:rPr>
+          <w:rFonts w:eastAsia="Times New Roman" w:cstheme="minorHAnsi"/>
+          <w:color w:val="1D1C1D"/>
+          <w:kern w:val="0"/>
+          <w:sz w:val="28"/>
+          <w:szCs w:val="28"/>
+          <w:lang w:eastAsia="en-IN" w:bidi="ta-IN"/>
+          <w14:ligatures w14:val="none"/>
+        </w:rPr>
+      </w:pPr>
+      <w:r>
+        <w:rPr>
+          <w:rFonts w:eastAsia="Times New Roman" w:cstheme="minorHAnsi"/>
+          <w:color w:val="1D1C1D"/>
+          <w:kern w:val="0"/>
+          <w:sz w:val="28"/>
+          <w:szCs w:val="28"/>
+          <w:lang w:eastAsia="en-IN" w:bidi="ta-IN"/>
+          <w14:ligatures w14:val="none"/>
+        </w:rPr>
+        <w:drawing>
+          <wp:inline distT="0" distB="0" distL="0" distR="0" wp14:anchorId="4867DE21" wp14:editId="35FFA882">
+            <wp:extent cx="7200900" cy="3130062"/>
+            <wp:effectExtent l="0" t="0" r="0" b="0"/>
+            <wp:docPr id="1604681523" name="Picture 1"/>
+            <wp:cNvGraphicFramePr>
+              <a:graphicFrameLocks xmlns:a="http://schemas.openxmlformats.org/drawingml/2006/main" noChangeAspect="1"/>
+            </wp:cNvGraphicFramePr>
+            <a:graphic xmlns:a="http://schemas.openxmlformats.org/drawingml/2006/main">
+              <a:graphicData uri="http://schemas.openxmlformats.org/drawingml/2006/picture">
+                <pic:pic xmlns:pic="http://schemas.openxmlformats.org/drawingml/2006/picture">
+                  <pic:nvPicPr>
+                    <pic:cNvPr id="1604681523" name=""/>
+                    <pic:cNvPicPr/>
+                  </pic:nvPicPr>
+                  <pic:blipFill>
+                    <a:blip r:embed="rId29"/>
+                    <a:stretch>
+                      <a:fillRect/>
+                    </a:stretch>
+                  </pic:blipFill>
+                  <pic:spPr>
+                    <a:xfrm>
+                      <a:off x="0" y="0"/>
+                      <a:ext cx="7209445" cy="3133776"/>
+                    </a:xfrm>
+                    <a:prstGeom prst="rect">
+                      <a:avLst/>
+                    </a:prstGeom>
+                  </pic:spPr>
+                </pic:pic>
+              </a:graphicData>
+            </a:graphic>
+          </wp:inline>
+        </w:drawing>
+      </w:r>
+    </w:p>
+    <w:p>
+      <w:pPr>
+        <w:pStyle w:val="ListParagraph"/>
+        <w:shd w:val="clear" w:color="auto" w:fill="F8F8F8"/>
+        <w:spacing w:before="100" w:beforeAutospacing="1" w:after="0" w:line="240" w:lineRule="auto"/>
+        <w:ind w:left="284"/>
+        <w:rPr>
+          <w:rFonts w:eastAsia="Times New Roman" w:cstheme="minorHAnsi"/>
+          <w:color w:val="1D1C1D"/>
+          <w:kern w:val="0"/>
+          <w:sz w:val="28"/>
+          <w:szCs w:val="28"/>
+          <w:lang w:eastAsia="en-IN" w:bidi="ta-IN"/>
+          <w14:ligatures w14:val="none"/>
+        </w:rPr>
+      </w:pPr>
+      <w:r>
+        <w:rPr>
+          <w:rFonts w:eastAsia="Times New Roman" w:cstheme="minorHAnsi"/>
+          <w:color w:val="1D1C1D"/>
+          <w:kern w:val="0"/>
+          <w:sz w:val="28"/>
+          <w:szCs w:val="28"/>
+          <w:lang w:eastAsia="en-IN" w:bidi="ta-IN"/>
+          <w14:ligatures w14:val="none"/>
+        </w:rPr>
+        <w:drawing>
+          <wp:inline distT="0" distB="0" distL="0" distR="0" wp14:anchorId="1FD618A7" wp14:editId="186EF929">
+            <wp:extent cx="7200900" cy="1910080"/>
+            <wp:effectExtent l="0" t="0" r="0" b="0"/>
+            <wp:docPr id="309862944" name="Picture 1"/>
+            <wp:cNvGraphicFramePr>
+              <a:graphicFrameLocks xmlns:a="http://schemas.openxmlformats.org/drawingml/2006/main" noChangeAspect="1"/>
+            </wp:cNvGraphicFramePr>
+            <a:graphic xmlns:a="http://schemas.openxmlformats.org/drawingml/2006/main">
+              <a:graphicData uri="http://schemas.openxmlformats.org/drawingml/2006/picture">
+                <pic:pic xmlns:pic="http://schemas.openxmlformats.org/drawingml/2006/picture">
+                  <pic:nvPicPr>
+                    <pic:cNvPr id="309862944" name=""/>
+                    <pic:cNvPicPr/>
+                  </pic:nvPicPr>
+                  <pic:blipFill>
+                    <a:blip r:embed="rId30"/>
+                    <a:stretch>
+                      <a:fillRect/>
+                    </a:stretch>
+                  </pic:blipFill>
+                  <pic:spPr>
+                    <a:xfrm>
+                      <a:off x="0" y="0"/>
+                      <a:ext cx="7200900" cy="1910080"/>
+                    </a:xfrm>
+                    <a:prstGeom prst="rect">
+                      <a:avLst/>
+                    </a:prstGeom>
+                  </pic:spPr>
+                </pic:pic>
+              </a:graphicData>
+            </a:graphic>
+          </wp:inline>
+        </w:drawing>
+      </w:r>
+    </w:p>
+    <w:p>
+      <w:pPr>
+        <w:pStyle w:val="ListParagraph"/>
+        <w:shd w:val="clear" w:color="auto" w:fill="F8F8F8"/>
+        <w:spacing w:before="100" w:beforeAutospacing="1" w:after="0" w:line="240" w:lineRule="auto"/>
+        <w:ind w:left="284"/>
+        <w:rPr>
+          <w:rFonts w:eastAsia="Times New Roman" w:cstheme="minorHAnsi"/>
+          <w:color w:val="1D1C1D"/>
+          <w:kern w:val="0"/>
+          <w:sz w:val="28"/>
+          <w:szCs w:val="28"/>
+          <w:lang w:eastAsia="en-IN" w:bidi="ta-IN"/>
+          <w14:ligatures w14:val="none"/>
+        </w:rPr>
+      </w:pPr>
+      <w:r>
+        <w:rPr>
+          <w:rFonts w:eastAsia="Times New Roman" w:cstheme="minorHAnsi"/>
+          <w:color w:val="1D1C1D"/>
+          <w:kern w:val="0"/>
+          <w:sz w:val="28"/>
+          <w:szCs w:val="28"/>
+          <w:lang w:eastAsia="en-IN" w:bidi="ta-IN"/>
+          <w14:ligatures w14:val="none"/>
+        </w:rPr>
+        <w:drawing>
+          <wp:inline distT="0" distB="0" distL="0" distR="0" wp14:anchorId="277C320F" wp14:editId="2001F80D">
+            <wp:extent cx="7200900" cy="2303780"/>
+            <wp:effectExtent l="0" t="0" r="0" b="1270"/>
+            <wp:docPr id="1847331188" name="Picture 1"/>
+            <wp:cNvGraphicFramePr>
+              <a:graphicFrameLocks xmlns:a="http://schemas.openxmlformats.org/drawingml/2006/main" noChangeAspect="1"/>
+            </wp:cNvGraphicFramePr>
+            <a:graphic xmlns:a="http://schemas.openxmlformats.org/drawingml/2006/main">
+              <a:graphicData uri="http://schemas.openxmlformats.org/drawingml/2006/picture">
+                <pic:pic xmlns:pic="http://schemas.openxmlformats.org/drawingml/2006/picture">
+                  <pic:nvPicPr>
+                    <pic:cNvPr id="1847331188" name=""/>
+                    <pic:cNvPicPr/>
+                  </pic:nvPicPr>
+                  <pic:blipFill>
+                    <a:blip r:embed="rId31"/>
+                    <a:stretch>
+                      <a:fillRect/>
+                    </a:stretch>
+                  </pic:blipFill>
+                  <pic:spPr>
+                    <a:xfrm>
+                      <a:off x="0" y="0"/>
+                      <a:ext cx="7200900" cy="2303780"/>
+                    </a:xfrm>
+                    <a:prstGeom prst="rect">
+                      <a:avLst/>
+                    </a:prstGeom>
+                  </pic:spPr>
+                </pic:pic>
+              </a:graphicData>
+            </a:graphic>
+          </wp:inline>
+        </w:drawing>
+      </w:r>
+    </w:p>
+    <w:p>
+      <w:pPr>
+        <w:spacing w:after="0"/>
+        <w:ind w:left="142"/>
+        <w:rPr>
+          <w:sz w:val="28"/>
+          <w:szCs w:val="28"/>
+        </w:rPr>
+      </w:pPr>
+    </w:p>
+    <w:p>
+      <w:pPr>
+        <w:spacing w:after="0"/>
+        <w:ind w:left="142"/>
+        <w:rPr>
+          <w:sz w:val="28"/>
+          <w:szCs w:val="28"/>
+        </w:rPr>
+      </w:pPr>
+      <w:r>
+        <w:rPr>
+          <w:sz w:val="28"/>
+          <w:szCs w:val="28"/>
+        </w:rPr>
+        <w:lastRenderedPageBreak/>
+        <w:t>Step 3: Select Build now to run the job.</w:t>
+      </w:r>
+    </w:p>
+    <w:p>
+      <w:pPr>
+        <w:spacing w:after="0"/>
+        <w:ind w:left="142"/>
+        <w:rPr>
+          <w:sz w:val="28"/>
+          <w:szCs w:val="28"/>
+        </w:rPr>
+      </w:pPr>
+      <w:r>
+        <w:rPr>
+          <w:sz w:val="28"/>
+          <w:szCs w:val="28"/>
+        </w:rPr>
+        <w:drawing>
+          <wp:inline distT="0" distB="0" distL="0" distR="0" wp14:anchorId="66C1EB93" wp14:editId="504019C1">
+            <wp:extent cx="7200900" cy="2337435"/>
+            <wp:effectExtent l="0" t="0" r="0" b="5715"/>
+            <wp:docPr id="121184472" name="Picture 1"/>
+            <wp:cNvGraphicFramePr>
+              <a:graphicFrameLocks xmlns:a="http://schemas.openxmlformats.org/drawingml/2006/main" noChangeAspect="1"/>
+            </wp:cNvGraphicFramePr>
+            <a:graphic xmlns:a="http://schemas.openxmlformats.org/drawingml/2006/main">
+              <a:graphicData uri="http://schemas.openxmlformats.org/drawingml/2006/picture">
+                <pic:pic xmlns:pic="http://schemas.openxmlformats.org/drawingml/2006/picture">
+                  <pic:nvPicPr>
+                    <pic:cNvPr id="121184472" name=""/>
+                    <pic:cNvPicPr/>
+                  </pic:nvPicPr>
+                  <pic:blipFill>
+                    <a:blip r:embed="rId32"/>
+                    <a:stretch>
+                      <a:fillRect/>
+                    </a:stretch>
+                  </pic:blipFill>
+                  <pic:spPr>
+                    <a:xfrm>
+                      <a:off x="0" y="0"/>
+                      <a:ext cx="7200900" cy="2337435"/>
+                    </a:xfrm>
+                    <a:prstGeom prst="rect">
+                      <a:avLst/>
+                    </a:prstGeom>
+                  </pic:spPr>
+                </pic:pic>
+              </a:graphicData>
+            </a:graphic>
+          </wp:inline>
+        </w:drawing>
+      </w:r>
+    </w:p>
+    <w:p>
+      <w:pPr>
+        <w:spacing w:after="0"/>
+        <w:ind w:left="142"/>
+        <w:rPr>
+          <w:sz w:val="28"/>
+          <w:szCs w:val="28"/>
+        </w:rPr>
+      </w:pPr>
+    </w:p>
+    <w:p>
+      <w:pPr>
+        <w:spacing w:after="0"/>
+        <w:ind w:left="142"/>
+        <w:rPr>
+          <w:sz w:val="32"/>
+          <w:szCs w:val="32"/>
+        </w:rPr>
+      </w:pPr>
+      <w:r>
+        <w:rPr>
+          <w:sz w:val="28"/>
+          <w:szCs w:val="28"/>
+        </w:rPr>
+        <w:t xml:space="preserve">   </w:t>
+      </w:r>
+      <w:r>
+        <w:rPr>
+          <w:b/>
+          <w:bCs/>
+          <w:sz w:val="32"/>
+          <w:szCs w:val="32"/>
+        </w:rPr>
+        <w:t>Repeat the same process to create remaining jobs.</w:t>
+      </w:r>
+    </w:p>
+    <w:p>
+      <w:pPr>
+        <w:spacing w:after="0"/>
+        <w:ind w:left="142"/>
+        <w:rPr>
+          <w:sz w:val="28"/>
+          <w:szCs w:val="28"/>
+        </w:rPr>
+      </w:pPr>
+    </w:p>
+    <w:p>
+      <w:pPr>
+        <w:pStyle w:val="ListParagraph"/>
+        <w:numPr>
+          <w:ilvl w:val="0"/>
+          <w:numId w:val="2"/>
+        </w:numPr>
+        <w:shd w:val="clear" w:color="auto" w:fill="F8F8F8"/>
+        <w:spacing w:after="0" w:line="240" w:lineRule="auto"/>
+        <w:ind w:left="284" w:hanging="294"/>
+        <w:rPr>
+          <w:rFonts w:eastAsia="Times New Roman" w:cstheme="minorHAnsi"/>
+          <w:color w:val="1D1C1D"/>
+          <w:kern w:val="0"/>
+          <w:sz w:val="36"/>
+          <w:szCs w:val="36"/>
+          <w:lang w:eastAsia="en-IN" w:bidi="ta-IN"/>
+          <w14:ligatures w14:val="none"/>
+        </w:rPr>
+      </w:pPr>
+      <w:r>
+        <w:rPr>
+          <w:rFonts w:eastAsia="Times New Roman" w:cstheme="minorHAnsi"/>
+          <w:color w:val="1D1C1D"/>
+          <w:kern w:val="0"/>
+          <w:sz w:val="36"/>
+          <w:szCs w:val="36"/>
+          <w:lang w:eastAsia="en-IN" w:bidi="ta-IN"/>
+          <w14:ligatures w14:val="none"/>
+        </w:rPr>
+        <w:t>Create one Jenkins job using git hub Private repository.</w:t>
+      </w:r>
+    </w:p>
+    <w:p>
+      <w:pPr>
+        <w:pStyle w:val="ListParagraph"/>
+        <w:shd w:val="clear" w:color="auto" w:fill="F8F8F8"/>
+        <w:spacing w:after="0" w:line="240" w:lineRule="auto"/>
+        <w:ind w:left="284"/>
+        <w:rPr>
+          <w:rFonts w:eastAsia="Times New Roman" w:cstheme="minorHAnsi"/>
+          <w:color w:val="1D1C1D"/>
+          <w:kern w:val="0"/>
+          <w:sz w:val="28"/>
+          <w:szCs w:val="28"/>
+          <w:lang w:eastAsia="en-IN" w:bidi="ta-IN"/>
+          <w14:ligatures w14:val="none"/>
+        </w:rPr>
+      </w:pPr>
+      <w:r>
+        <w:rPr>
+          <w:rFonts w:eastAsia="Times New Roman" w:cstheme="minorHAnsi"/>
+          <w:color w:val="1D1C1D"/>
+          <w:kern w:val="0"/>
+          <w:sz w:val="28"/>
+          <w:szCs w:val="28"/>
+          <w:lang w:eastAsia="en-IN" w:bidi="ta-IN"/>
+          <w14:ligatures w14:val="none"/>
+        </w:rPr>
+        <w:t xml:space="preserve">Step 1: </w:t>
+      </w:r>
+      <w:r>
+        <w:rPr>
+          <w:rFonts w:eastAsia="Times New Roman" w:cstheme="minorHAnsi"/>
+          <w:color w:val="1D1C1D"/>
+          <w:kern w:val="0"/>
+          <w:sz w:val="28"/>
+          <w:szCs w:val="28"/>
+          <w:lang w:eastAsia="en-IN" w:bidi="ta-IN"/>
+          <w14:ligatures w14:val="none"/>
+        </w:rPr>
+        <w:t>Goto GitHub</w:t>
+      </w:r>
+      <w:r>
+        <w:rPr>
+          <w:rFonts w:eastAsia="Times New Roman" w:cstheme="minorHAnsi"/>
+          <w:color w:val="1D1C1D"/>
+          <w:kern w:val="0"/>
+          <w:sz w:val="28"/>
+          <w:szCs w:val="28"/>
+          <w:lang w:eastAsia="en-IN" w:bidi="ta-IN"/>
+          <w14:ligatures w14:val="none"/>
+        </w:rPr>
+        <w:sym w:font="Wingdings" w:char="F0E0"/>
+      </w:r>
+      <w:r>
+        <w:rPr>
+          <w:rFonts w:eastAsia="Times New Roman" w:cstheme="minorHAnsi"/>
+          <w:color w:val="1D1C1D"/>
+          <w:kern w:val="0"/>
+          <w:sz w:val="28"/>
+          <w:szCs w:val="28"/>
+          <w:lang w:eastAsia="en-IN" w:bidi="ta-IN"/>
+          <w14:ligatures w14:val="none"/>
+        </w:rPr>
+        <w:t>settings</w:t>
+      </w:r>
+      <w:r>
+        <w:rPr>
+          <w:rFonts w:eastAsia="Times New Roman" w:cstheme="minorHAnsi"/>
+          <w:color w:val="1D1C1D"/>
+          <w:kern w:val="0"/>
+          <w:sz w:val="28"/>
+          <w:szCs w:val="28"/>
+          <w:lang w:eastAsia="en-IN" w:bidi="ta-IN"/>
+          <w14:ligatures w14:val="none"/>
+        </w:rPr>
+        <w:sym w:font="Wingdings" w:char="F0E0"/>
+      </w:r>
+      <w:r>
+        <w:rPr>
+          <w:rFonts w:eastAsia="Times New Roman" w:cstheme="minorHAnsi"/>
+          <w:color w:val="1D1C1D"/>
+          <w:kern w:val="0"/>
+          <w:sz w:val="28"/>
+          <w:szCs w:val="28"/>
+          <w:lang w:eastAsia="en-IN" w:bidi="ta-IN"/>
+          <w14:ligatures w14:val="none"/>
+        </w:rPr>
+        <w:t>Developer Settings</w:t>
+      </w:r>
+      <w:r>
+        <w:rPr>
+          <w:rFonts w:eastAsia="Times New Roman" w:cstheme="minorHAnsi"/>
+          <w:color w:val="1D1C1D"/>
+          <w:kern w:val="0"/>
+          <w:sz w:val="28"/>
+          <w:szCs w:val="28"/>
+          <w:lang w:eastAsia="en-IN" w:bidi="ta-IN"/>
+          <w14:ligatures w14:val="none"/>
+        </w:rPr>
+        <w:sym w:font="Wingdings" w:char="F0E0"/>
+      </w:r>
+      <w:r>
+        <w:rPr>
+          <w:rFonts w:eastAsia="Times New Roman" w:cstheme="minorHAnsi"/>
+          <w:color w:val="1D1C1D"/>
+          <w:kern w:val="0"/>
+          <w:sz w:val="28"/>
+          <w:szCs w:val="28"/>
+          <w:lang w:eastAsia="en-IN" w:bidi="ta-IN"/>
+          <w14:ligatures w14:val="none"/>
+        </w:rPr>
+        <w:t>Personal access tokens</w:t>
+      </w:r>
+      <w:r>
+        <w:rPr>
+          <w:rFonts w:eastAsia="Times New Roman" w:cstheme="minorHAnsi"/>
+          <w:color w:val="1D1C1D"/>
+          <w:kern w:val="0"/>
+          <w:sz w:val="28"/>
+          <w:szCs w:val="28"/>
+          <w:lang w:eastAsia="en-IN" w:bidi="ta-IN"/>
+          <w14:ligatures w14:val="none"/>
+        </w:rPr>
+        <w:sym w:font="Wingdings" w:char="F0E0"/>
+      </w:r>
+      <w:r>
+        <w:rPr>
+          <w:rFonts w:eastAsia="Times New Roman" w:cstheme="minorHAnsi"/>
+          <w:color w:val="1D1C1D"/>
+          <w:kern w:val="0"/>
+          <w:sz w:val="28"/>
+          <w:szCs w:val="28"/>
+          <w:lang w:eastAsia="en-IN" w:bidi="ta-IN"/>
+          <w14:ligatures w14:val="none"/>
+        </w:rPr>
+        <w:t>Tokens(classic)</w:t>
+      </w:r>
+      <w:r>
+        <w:rPr>
+          <w:rFonts w:eastAsia="Times New Roman" w:cstheme="minorHAnsi"/>
+          <w:color w:val="1D1C1D"/>
+          <w:kern w:val="0"/>
+          <w:sz w:val="28"/>
+          <w:szCs w:val="28"/>
+          <w:lang w:eastAsia="en-IN" w:bidi="ta-IN"/>
+          <w14:ligatures w14:val="none"/>
+        </w:rPr>
+        <w:sym w:font="Wingdings" w:char="F0E0"/>
+      </w:r>
+      <w:r>
+        <w:rPr>
+          <w:rFonts w:eastAsia="Times New Roman" w:cstheme="minorHAnsi"/>
+          <w:color w:val="1D1C1D"/>
+          <w:kern w:val="0"/>
+          <w:sz w:val="28"/>
+          <w:szCs w:val="28"/>
+          <w:lang w:eastAsia="en-IN" w:bidi="ta-IN"/>
+          <w14:ligatures w14:val="none"/>
+        </w:rPr>
+        <w:t xml:space="preserve"> Generate new token</w:t>
+      </w:r>
+    </w:p>
+    <w:p>
+      <w:pPr>
+        <w:pStyle w:val="ListParagraph"/>
+        <w:shd w:val="clear" w:color="auto" w:fill="F8F8F8"/>
+        <w:spacing w:after="0" w:line="240" w:lineRule="auto"/>
+        <w:ind w:left="284"/>
+        <w:rPr>
+          <w:rFonts w:eastAsia="Times New Roman" w:cstheme="minorHAnsi"/>
+          <w:color w:val="1D1C1D"/>
+          <w:kern w:val="0"/>
+          <w:sz w:val="28"/>
+          <w:szCs w:val="28"/>
+          <w:lang w:eastAsia="en-IN" w:bidi="ta-IN"/>
+          <w14:ligatures w14:val="none"/>
+        </w:rPr>
+      </w:pPr>
+      <w:r>
+        <w:rPr>
+          <w:rFonts w:eastAsia="Times New Roman" w:cstheme="minorHAnsi"/>
+          <w:color w:val="1D1C1D"/>
+          <w:kern w:val="0"/>
+          <w:sz w:val="28"/>
+          <w:szCs w:val="28"/>
+          <w:lang w:eastAsia="en-IN" w:bidi="ta-IN"/>
+          <w14:ligatures w14:val="none"/>
+        </w:rPr>
+        <w:drawing>
+          <wp:inline distT="0" distB="0" distL="0" distR="0" wp14:anchorId="11202E7D" wp14:editId="52936CD5">
+            <wp:extent cx="7200900" cy="2513965"/>
+            <wp:effectExtent l="0" t="0" r="0" b="635"/>
+            <wp:docPr id="451764305" name="Picture 1"/>
+            <wp:cNvGraphicFramePr>
+              <a:graphicFrameLocks xmlns:a="http://schemas.openxmlformats.org/drawingml/2006/main" noChangeAspect="1"/>
+            </wp:cNvGraphicFramePr>
+            <a:graphic xmlns:a="http://schemas.openxmlformats.org/drawingml/2006/main">
+              <a:graphicData uri="http://schemas.openxmlformats.org/drawingml/2006/picture">
+                <pic:pic xmlns:pic="http://schemas.openxmlformats.org/drawingml/2006/picture">
+                  <pic:nvPicPr>
+                    <pic:cNvPr id="451764305" name=""/>
+                    <pic:cNvPicPr/>
+                  </pic:nvPicPr>
+                  <pic:blipFill>
+                    <a:blip r:embed="rId33"/>
+                    <a:stretch>
+                      <a:fillRect/>
+                    </a:stretch>
+                  </pic:blipFill>
+                  <pic:spPr>
+                    <a:xfrm>
+                      <a:off x="0" y="0"/>
+                      <a:ext cx="7200900" cy="2513965"/>
+                    </a:xfrm>
+                    <a:prstGeom prst="rect">
+                      <a:avLst/>
+                    </a:prstGeom>
+                  </pic:spPr>
+                </pic:pic>
+              </a:graphicData>
+            </a:graphic>
+          </wp:inline>
+        </w:drawing>
+      </w:r>
+    </w:p>
+    <w:p>
+      <w:pPr>
+        <w:pStyle w:val="ListParagraph"/>
+        <w:shd w:val="clear" w:color="auto" w:fill="F8F8F8"/>
+        <w:spacing w:after="0" w:line="240" w:lineRule="auto"/>
+        <w:ind w:left="284"/>
+        <w:rPr>
+          <w:rFonts w:eastAsia="Times New Roman" w:cstheme="minorHAnsi"/>
+          <w:color w:val="1D1C1D"/>
+          <w:kern w:val="0"/>
+          <w:sz w:val="28"/>
+          <w:szCs w:val="28"/>
+          <w:lang w:eastAsia="en-IN" w:bidi="ta-IN"/>
+          <w14:ligatures w14:val="none"/>
+        </w:rPr>
+      </w:pPr>
+      <w:r>
+        <w:rPr>
+          <w:rFonts w:eastAsia="Times New Roman" w:cstheme="minorHAnsi"/>
+          <w:color w:val="1D1C1D"/>
+          <w:kern w:val="0"/>
+          <w:sz w:val="28"/>
+          <w:szCs w:val="28"/>
+          <w:lang w:eastAsia="en-IN" w:bidi="ta-IN"/>
+          <w14:ligatures w14:val="none"/>
+        </w:rPr>
+        <w:drawing>
+          <wp:inline distT="0" distB="0" distL="0" distR="0" wp14:anchorId="709B29A3" wp14:editId="79F4182C">
+            <wp:extent cx="7200900" cy="1739900"/>
+            <wp:effectExtent l="0" t="0" r="0" b="0"/>
+            <wp:docPr id="1907770237" name="Picture 1"/>
+            <wp:cNvGraphicFramePr>
+              <a:graphicFrameLocks xmlns:a="http://schemas.openxmlformats.org/drawingml/2006/main" noChangeAspect="1"/>
+            </wp:cNvGraphicFramePr>
+            <a:graphic xmlns:a="http://schemas.openxmlformats.org/drawingml/2006/main">
+              <a:graphicData uri="http://schemas.openxmlformats.org/drawingml/2006/picture">
+                <pic:pic xmlns:pic="http://schemas.openxmlformats.org/drawingml/2006/picture">
+                  <pic:nvPicPr>
+                    <pic:cNvPr id="1907770237" name=""/>
+                    <pic:cNvPicPr/>
+                  </pic:nvPicPr>
+                  <pic:blipFill>
+                    <a:blip r:embed="rId34"/>
+                    <a:stretch>
+                      <a:fillRect/>
+                    </a:stretch>
+                  </pic:blipFill>
+                  <pic:spPr>
+                    <a:xfrm>
+                      <a:off x="0" y="0"/>
+                      <a:ext cx="7200900" cy="1739900"/>
+                    </a:xfrm>
+                    <a:prstGeom prst="rect">
+                      <a:avLst/>
+                    </a:prstGeom>
+                  </pic:spPr>
+                </pic:pic>
+              </a:graphicData>
+            </a:graphic>
+          </wp:inline>
+        </w:drawing>
+      </w:r>
+    </w:p>
+    <w:p>
+      <w:pPr>
+        <w:pStyle w:val="ListParagraph"/>
+        <w:shd w:val="clear" w:color="auto" w:fill="F8F8F8"/>
+        <w:spacing w:after="0" w:line="240" w:lineRule="auto"/>
+        <w:ind w:left="284"/>
+        <w:rPr>
+          <w:rFonts w:eastAsia="Times New Roman" w:cstheme="minorHAnsi"/>
+          <w:color w:val="1D1C1D"/>
+          <w:kern w:val="0"/>
+          <w:sz w:val="28"/>
+          <w:szCs w:val="28"/>
+          <w:lang w:eastAsia="en-IN" w:bidi="ta-IN"/>
+          <w14:ligatures w14:val="none"/>
+        </w:rPr>
+      </w:pPr>
+      <w:r>
+        <w:rPr>
+          <w:rFonts w:eastAsia="Times New Roman" w:cstheme="minorHAnsi"/>
+          <w:color w:val="1D1C1D"/>
+          <w:kern w:val="0"/>
+          <w:sz w:val="28"/>
+          <w:szCs w:val="28"/>
+          <w:lang w:eastAsia="en-IN" w:bidi="ta-IN"/>
+          <w14:ligatures w14:val="none"/>
+        </w:rPr>
+        <w:t>Step 2: Now Goto Jenkins</w:t>
+      </w:r>
+      <w:r>
+        <w:rPr>
+          <w:rFonts w:eastAsia="Times New Roman" w:cstheme="minorHAnsi"/>
+          <w:color w:val="1D1C1D"/>
+          <w:kern w:val="0"/>
+          <w:sz w:val="28"/>
+          <w:szCs w:val="28"/>
+          <w:lang w:eastAsia="en-IN" w:bidi="ta-IN"/>
+          <w14:ligatures w14:val="none"/>
+        </w:rPr>
+        <w:sym w:font="Wingdings" w:char="F0E0"/>
+      </w:r>
+      <w:r>
+        <w:rPr>
+          <w:rFonts w:eastAsia="Times New Roman" w:cstheme="minorHAnsi"/>
+          <w:color w:val="1D1C1D"/>
+          <w:kern w:val="0"/>
+          <w:sz w:val="28"/>
+          <w:szCs w:val="28"/>
+          <w:lang w:eastAsia="en-IN" w:bidi="ta-IN"/>
+          <w14:ligatures w14:val="none"/>
+        </w:rPr>
+        <w:t>manage Jenkins</w:t>
+      </w:r>
+      <w:r>
+        <w:rPr>
+          <w:rFonts w:eastAsia="Times New Roman" w:cstheme="minorHAnsi"/>
+          <w:color w:val="1D1C1D"/>
+          <w:kern w:val="0"/>
+          <w:sz w:val="28"/>
+          <w:szCs w:val="28"/>
+          <w:lang w:eastAsia="en-IN" w:bidi="ta-IN"/>
+          <w14:ligatures w14:val="none"/>
+        </w:rPr>
+        <w:sym w:font="Wingdings" w:char="F0E0"/>
+      </w:r>
+      <w:r>
+        <w:rPr>
+          <w:rFonts w:eastAsia="Times New Roman" w:cstheme="minorHAnsi"/>
+          <w:color w:val="1D1C1D"/>
+          <w:kern w:val="0"/>
+          <w:sz w:val="28"/>
+          <w:szCs w:val="28"/>
+          <w:lang w:eastAsia="en-IN" w:bidi="ta-IN"/>
+          <w14:ligatures w14:val="none"/>
+        </w:rPr>
+        <w:t>credentials</w:t>
+      </w:r>
+      <w:r>
+        <w:rPr>
+          <w:rFonts w:eastAsia="Times New Roman" w:cstheme="minorHAnsi"/>
+          <w:color w:val="1D1C1D"/>
+          <w:kern w:val="0"/>
+          <w:sz w:val="28"/>
+          <w:szCs w:val="28"/>
+          <w:lang w:eastAsia="en-IN" w:bidi="ta-IN"/>
+          <w14:ligatures w14:val="none"/>
+        </w:rPr>
+        <w:sym w:font="Wingdings" w:char="F0E0"/>
+      </w:r>
+      <w:r>
+        <w:rPr>
+          <w:rFonts w:eastAsia="Times New Roman" w:cstheme="minorHAnsi"/>
+          <w:color w:val="1D1C1D"/>
+          <w:kern w:val="0"/>
+          <w:sz w:val="28"/>
+          <w:szCs w:val="28"/>
+          <w:lang w:eastAsia="en-IN" w:bidi="ta-IN"/>
+          <w14:ligatures w14:val="none"/>
+        </w:rPr>
+        <w:t>global</w:t>
+      </w:r>
+      <w:r>
+        <w:rPr>
+          <w:rFonts w:eastAsia="Times New Roman" w:cstheme="minorHAnsi"/>
+          <w:color w:val="1D1C1D"/>
+          <w:kern w:val="0"/>
+          <w:sz w:val="28"/>
+          <w:szCs w:val="28"/>
+          <w:lang w:eastAsia="en-IN" w:bidi="ta-IN"/>
+          <w14:ligatures w14:val="none"/>
+        </w:rPr>
+        <w:sym w:font="Wingdings" w:char="F0E0"/>
+      </w:r>
+      <w:r>
+        <w:rPr>
+          <w:rFonts w:eastAsia="Times New Roman" w:cstheme="minorHAnsi"/>
+          <w:color w:val="1D1C1D"/>
+          <w:kern w:val="0"/>
+          <w:sz w:val="28"/>
+          <w:szCs w:val="28"/>
+          <w:lang w:eastAsia="en-IN" w:bidi="ta-IN"/>
+          <w14:ligatures w14:val="none"/>
+        </w:rPr>
+        <w:t>Add credentials.</w:t>
+      </w:r>
+    </w:p>
+    <w:p>
+      <w:pPr>
+        <w:pStyle w:val="ListParagraph"/>
+        <w:shd w:val="clear" w:color="auto" w:fill="F8F8F8"/>
+        <w:spacing w:after="0" w:line="240" w:lineRule="auto"/>
+        <w:ind w:left="284"/>
+        <w:rPr>
+          <w:rFonts w:eastAsia="Times New Roman" w:cstheme="minorHAnsi"/>
+          <w:color w:val="1D1C1D"/>
+          <w:kern w:val="0"/>
+          <w:sz w:val="28"/>
+          <w:szCs w:val="28"/>
+          <w:lang w:eastAsia="en-IN" w:bidi="ta-IN"/>
+          <w14:ligatures w14:val="none"/>
+        </w:rPr>
+      </w:pPr>
+      <w:r>
+        <w:rPr>
+          <w:rFonts w:eastAsia="Times New Roman" w:cstheme="minorHAnsi"/>
+          <w:color w:val="1D1C1D"/>
+          <w:kern w:val="0"/>
+          <w:sz w:val="28"/>
+          <w:szCs w:val="28"/>
+          <w:lang w:eastAsia="en-IN" w:bidi="ta-IN"/>
+          <w14:ligatures w14:val="none"/>
+        </w:rPr>
+        <w:drawing>
+          <wp:inline distT="0" distB="0" distL="0" distR="0" wp14:anchorId="57C51A0C" wp14:editId="0D32B68B">
+            <wp:extent cx="7200900" cy="1613535"/>
+            <wp:effectExtent l="0" t="0" r="0" b="5715"/>
+            <wp:docPr id="1299873158" name="Picture 1"/>
+            <wp:cNvGraphicFramePr>
+              <a:graphicFrameLocks xmlns:a="http://schemas.openxmlformats.org/drawingml/2006/main" noChangeAspect="1"/>
+            </wp:cNvGraphicFramePr>
+            <a:graphic xmlns:a="http://schemas.openxmlformats.org/drawingml/2006/main">
+              <a:graphicData uri="http://schemas.openxmlformats.org/drawingml/2006/picture">
+                <pic:pic xmlns:pic="http://schemas.openxmlformats.org/drawingml/2006/picture">
+                  <pic:nvPicPr>
+                    <pic:cNvPr id="1299873158" name=""/>
+                    <pic:cNvPicPr/>
+                  </pic:nvPicPr>
+                  <pic:blipFill>
+                    <a:blip r:embed="rId35"/>
+                    <a:stretch>
+                      <a:fillRect/>
+                    </a:stretch>
+                  </pic:blipFill>
+                  <pic:spPr>
+                    <a:xfrm>
+                      <a:off x="0" y="0"/>
+                      <a:ext cx="7200900" cy="1613535"/>
+                    </a:xfrm>
+                    <a:prstGeom prst="rect">
+                      <a:avLst/>
+                    </a:prstGeom>
+                  </pic:spPr>
+                </pic:pic>
+              </a:graphicData>
+            </a:graphic>
+          </wp:inline>
+        </w:drawing>
+      </w:r>
+    </w:p>
+    <w:p>
+      <w:pPr>
+        <w:pStyle w:val="ListParagraph"/>
+        <w:shd w:val="clear" w:color="auto" w:fill="F8F8F8"/>
+        <w:spacing w:after="0" w:line="240" w:lineRule="auto"/>
+        <w:ind w:left="284"/>
+        <w:rPr>
+          <w:rFonts w:eastAsia="Times New Roman" w:cstheme="minorHAnsi"/>
+          <w:color w:val="1D1C1D"/>
+          <w:kern w:val="0"/>
+          <w:sz w:val="28"/>
+          <w:szCs w:val="28"/>
+          <w:lang w:eastAsia="en-IN" w:bidi="ta-IN"/>
+          <w14:ligatures w14:val="none"/>
+        </w:rPr>
+      </w:pPr>
+    </w:p>
+    <w:p>
+      <w:pPr>
+        <w:pStyle w:val="ListParagraph"/>
+        <w:shd w:val="clear" w:color="auto" w:fill="F8F8F8"/>
+        <w:spacing w:after="0" w:line="240" w:lineRule="auto"/>
+        <w:ind w:left="284"/>
+        <w:rPr>
+          <w:rFonts w:eastAsia="Times New Roman" w:cstheme="minorHAnsi"/>
+          <w:color w:val="1D1C1D"/>
+          <w:kern w:val="0"/>
+          <w:sz w:val="28"/>
+          <w:szCs w:val="28"/>
+          <w:lang w:eastAsia="en-IN" w:bidi="ta-IN"/>
+          <w14:ligatures w14:val="none"/>
+        </w:rPr>
+      </w:pPr>
+      <w:r>
+        <w:rPr>
+          <w:rFonts w:eastAsia="Times New Roman" w:cstheme="minorHAnsi"/>
+          <w:color w:val="1D1C1D"/>
+          <w:kern w:val="0"/>
+          <w:sz w:val="28"/>
+          <w:szCs w:val="28"/>
+          <w:lang w:eastAsia="en-IN" w:bidi="ta-IN"/>
+          <w14:ligatures w14:val="none"/>
+        </w:rPr>
+        <w:lastRenderedPageBreak/>
+        <w:drawing>
+          <wp:inline distT="0" distB="0" distL="0" distR="0" wp14:anchorId="009B267F" wp14:editId="1F82547D">
+            <wp:extent cx="7200900" cy="3696335"/>
+            <wp:effectExtent l="0" t="0" r="0" b="0"/>
+            <wp:docPr id="1815154531" name="Picture 1"/>
+            <wp:cNvGraphicFramePr>
+              <a:graphicFrameLocks xmlns:a="http://schemas.openxmlformats.org/drawingml/2006/main" noChangeAspect="1"/>
+            </wp:cNvGraphicFramePr>
+            <a:graphic xmlns:a="http://schemas.openxmlformats.org/drawingml/2006/main">
+              <a:graphicData uri="http://schemas.openxmlformats.org/drawingml/2006/picture">
+                <pic:pic xmlns:pic="http://schemas.openxmlformats.org/drawingml/2006/picture">
+                  <pic:nvPicPr>
+                    <pic:cNvPr id="1815154531" name=""/>
+                    <pic:cNvPicPr/>
+                  </pic:nvPicPr>
+                  <pic:blipFill>
+                    <a:blip r:embed="rId36"/>
+                    <a:stretch>
+                      <a:fillRect/>
+                    </a:stretch>
+                  </pic:blipFill>
+                  <pic:spPr>
+                    <a:xfrm>
+                      <a:off x="0" y="0"/>
+                      <a:ext cx="7200900" cy="3696335"/>
+                    </a:xfrm>
+                    <a:prstGeom prst="rect">
+                      <a:avLst/>
+                    </a:prstGeom>
+                  </pic:spPr>
+                </pic:pic>
+              </a:graphicData>
+            </a:graphic>
+          </wp:inline>
+        </w:drawing>
+      </w:r>
+    </w:p>
+    <w:p>
+      <w:pPr>
+        <w:pStyle w:val="ListParagraph"/>
+        <w:shd w:val="clear" w:color="auto" w:fill="F8F8F8"/>
+        <w:spacing w:after="0" w:line="240" w:lineRule="auto"/>
+        <w:ind w:left="284"/>
+        <w:rPr>
+          <w:rFonts w:eastAsia="Times New Roman" w:cstheme="minorHAnsi"/>
+          <w:color w:val="1D1C1D"/>
+          <w:kern w:val="0"/>
+          <w:sz w:val="28"/>
+          <w:szCs w:val="28"/>
+          <w:lang w:eastAsia="en-IN" w:bidi="ta-IN"/>
+          <w14:ligatures w14:val="none"/>
+        </w:rPr>
+      </w:pPr>
+      <w:r>
+        <w:rPr>
+          <w:rFonts w:eastAsia="Times New Roman" w:cstheme="minorHAnsi"/>
+          <w:color w:val="1D1C1D"/>
+          <w:kern w:val="0"/>
+          <w:sz w:val="28"/>
+          <w:szCs w:val="28"/>
+          <w:lang w:eastAsia="en-IN" w:bidi="ta-IN"/>
+          <w14:ligatures w14:val="none"/>
+        </w:rPr>
+        <w:drawing>
+          <wp:inline distT="0" distB="0" distL="0" distR="0" wp14:anchorId="611EE37A" wp14:editId="67AE6178">
+            <wp:extent cx="7200900" cy="1684655"/>
+            <wp:effectExtent l="0" t="0" r="0" b="0"/>
+            <wp:docPr id="535064803" name="Picture 1"/>
+            <wp:cNvGraphicFramePr>
+              <a:graphicFrameLocks xmlns:a="http://schemas.openxmlformats.org/drawingml/2006/main" noChangeAspect="1"/>
+            </wp:cNvGraphicFramePr>
+            <a:graphic xmlns:a="http://schemas.openxmlformats.org/drawingml/2006/main">
+              <a:graphicData uri="http://schemas.openxmlformats.org/drawingml/2006/picture">
+                <pic:pic xmlns:pic="http://schemas.openxmlformats.org/drawingml/2006/picture">
+                  <pic:nvPicPr>
+                    <pic:cNvPr id="535064803" name=""/>
+                    <pic:cNvPicPr/>
+                  </pic:nvPicPr>
+                  <pic:blipFill>
+                    <a:blip r:embed="rId37"/>
+                    <a:stretch>
+                      <a:fillRect/>
+                    </a:stretch>
+                  </pic:blipFill>
+                  <pic:spPr>
+                    <a:xfrm>
+                      <a:off x="0" y="0"/>
+                      <a:ext cx="7200900" cy="1684655"/>
+                    </a:xfrm>
+                    <a:prstGeom prst="rect">
+                      <a:avLst/>
+                    </a:prstGeom>
+                  </pic:spPr>
+                </pic:pic>
+              </a:graphicData>
+            </a:graphic>
+          </wp:inline>
+        </w:drawing>
+      </w:r>
+    </w:p>
+    <w:p>
+      <w:pPr>
+        <w:pStyle w:val="ListParagraph"/>
+        <w:shd w:val="clear" w:color="auto" w:fill="F8F8F8"/>
+        <w:spacing w:after="0" w:line="240" w:lineRule="auto"/>
+        <w:ind w:left="284"/>
+        <w:rPr>
+          <w:rFonts w:eastAsia="Times New Roman" w:cstheme="minorHAnsi"/>
+          <w:color w:val="1D1C1D"/>
+          <w:kern w:val="0"/>
+          <w:sz w:val="28"/>
+          <w:szCs w:val="28"/>
+          <w:lang w:eastAsia="en-IN" w:bidi="ta-IN"/>
+          <w14:ligatures w14:val="none"/>
+        </w:rPr>
+      </w:pPr>
+      <w:r>
+        <w:rPr>
+          <w:rFonts w:eastAsia="Times New Roman" w:cstheme="minorHAnsi"/>
+          <w:color w:val="1D1C1D"/>
+          <w:kern w:val="0"/>
+          <w:sz w:val="28"/>
+          <w:szCs w:val="28"/>
+          <w:lang w:eastAsia="en-IN" w:bidi="ta-IN"/>
+          <w14:ligatures w14:val="none"/>
+        </w:rPr>
+        <w:t>Step 3: copy link of private repo and create a job.</w:t>
+      </w:r>
+    </w:p>
+    <w:p>
+      <w:pPr>
+        <w:pStyle w:val="ListParagraph"/>
+        <w:shd w:val="clear" w:color="auto" w:fill="F8F8F8"/>
+        <w:spacing w:after="0" w:line="240" w:lineRule="auto"/>
+        <w:ind w:left="284"/>
+        <w:rPr>
+          <w:rFonts w:eastAsia="Times New Roman" w:cstheme="minorHAnsi"/>
+          <w:color w:val="1D1C1D"/>
+          <w:kern w:val="0"/>
+          <w:sz w:val="28"/>
+          <w:szCs w:val="28"/>
+          <w:lang w:eastAsia="en-IN" w:bidi="ta-IN"/>
+          <w14:ligatures w14:val="none"/>
+        </w:rPr>
+      </w:pPr>
+      <w:r>
+        <w:rPr>
+          <w:rFonts w:eastAsia="Times New Roman" w:cstheme="minorHAnsi"/>
+          <w:color w:val="1D1C1D"/>
+          <w:kern w:val="0"/>
+          <w:sz w:val="28"/>
+          <w:szCs w:val="28"/>
+          <w:lang w:eastAsia="en-IN" w:bidi="ta-IN"/>
+          <w14:ligatures w14:val="none"/>
+        </w:rPr>
+        <w:drawing>
+          <wp:inline distT="0" distB="0" distL="0" distR="0" wp14:anchorId="68D08241" wp14:editId="5975EA72">
+            <wp:extent cx="7200900" cy="2195195"/>
+            <wp:effectExtent l="0" t="0" r="0" b="0"/>
+            <wp:docPr id="644012" name="Picture 1"/>
+            <wp:cNvGraphicFramePr>
+              <a:graphicFrameLocks xmlns:a="http://schemas.openxmlformats.org/drawingml/2006/main" noChangeAspect="1"/>
+            </wp:cNvGraphicFramePr>
+            <a:graphic xmlns:a="http://schemas.openxmlformats.org/drawingml/2006/main">
+              <a:graphicData uri="http://schemas.openxmlformats.org/drawingml/2006/picture">
+                <pic:pic xmlns:pic="http://schemas.openxmlformats.org/drawingml/2006/picture">
+                  <pic:nvPicPr>
+                    <pic:cNvPr id="644012" name=""/>
+                    <pic:cNvPicPr/>
+                  </pic:nvPicPr>
+                  <pic:blipFill>
+                    <a:blip r:embed="rId38"/>
+                    <a:stretch>
+                      <a:fillRect/>
+                    </a:stretch>
+                  </pic:blipFill>
+                  <pic:spPr>
+                    <a:xfrm>
+                      <a:off x="0" y="0"/>
+                      <a:ext cx="7200900" cy="2195195"/>
+                    </a:xfrm>
+                    <a:prstGeom prst="rect">
+                      <a:avLst/>
+                    </a:prstGeom>
+                  </pic:spPr>
+                </pic:pic>
+              </a:graphicData>
+            </a:graphic>
+          </wp:inline>
+        </w:drawing>
+      </w:r>
+    </w:p>
+    <w:p>
+      <w:pPr>
+        <w:spacing w:after="0"/>
+        <w:ind w:left="142"/>
+        <w:rPr>
+          <w:sz w:val="28"/>
+          <w:szCs w:val="28"/>
+        </w:rPr>
+      </w:pPr>
+      <w:r>
+        <w:rPr>
+          <w:sz w:val="28"/>
+          <w:szCs w:val="28"/>
+        </w:rPr>
+        <w:drawing>
+          <wp:inline distT="0" distB="0" distL="0" distR="0" wp14:anchorId="2A55A863" wp14:editId="6E44FD95">
+            <wp:extent cx="7200900" cy="2431415"/>
+            <wp:effectExtent l="0" t="0" r="0" b="6985"/>
+            <wp:docPr id="348912325" name="Picture 1"/>
+            <wp:cNvGraphicFramePr>
+              <a:graphicFrameLocks xmlns:a="http://schemas.openxmlformats.org/drawingml/2006/main" noChangeAspect="1"/>
+            </wp:cNvGraphicFramePr>
+            <a:graphic xmlns:a="http://schemas.openxmlformats.org/drawingml/2006/main">
+              <a:graphicData uri="http://schemas.openxmlformats.org/drawingml/2006/picture">
+                <pic:pic xmlns:pic="http://schemas.openxmlformats.org/drawingml/2006/picture">
+                  <pic:nvPicPr>
+                    <pic:cNvPr id="348912325" name=""/>
+                    <pic:cNvPicPr/>
+                  </pic:nvPicPr>
+                  <pic:blipFill>
+                    <a:blip r:embed="rId39"/>
+                    <a:stretch>
+                      <a:fillRect/>
+                    </a:stretch>
+                  </pic:blipFill>
+                  <pic:spPr>
+                    <a:xfrm>
+                      <a:off x="0" y="0"/>
+                      <a:ext cx="7200900" cy="2431415"/>
+                    </a:xfrm>
+                    <a:prstGeom prst="rect">
+                      <a:avLst/>
+                    </a:prstGeom>
+                  </pic:spPr>
+                </pic:pic>
+              </a:graphicData>
+            </a:graphic>
+          </wp:inline>
+        </w:drawing>
+      </w:r>
+    </w:p>
+    <w:p>
+      <w:pPr>
+        <w:spacing w:after="0"/>
+        <w:ind w:left="142"/>
+        <w:rPr>
+          <w:sz w:val="28"/>
+          <w:szCs w:val="28"/>
+        </w:rPr>
+      </w:pPr>
+      <w:r>
+        <w:rPr>
+          <w:sz w:val="28"/>
+          <w:szCs w:val="28"/>
+        </w:rPr>
+        <w:lastRenderedPageBreak/>
+        <w:t>Step 4: Select Build Now to run the job.</w:t>
+      </w:r>
+    </w:p>
+    <w:p>
+      <w:pPr>
+        <w:spacing w:after="0"/>
+        <w:ind w:left="142"/>
+        <w:rPr>
+          <w:sz w:val="28"/>
+          <w:szCs w:val="28"/>
+        </w:rPr>
+      </w:pPr>
+      <w:r>
+        <w:rPr>
+          <w:sz w:val="28"/>
+          <w:szCs w:val="28"/>
+        </w:rPr>
+        <w:drawing>
+          <wp:inline distT="0" distB="0" distL="0" distR="0" wp14:anchorId="3CAD35EB" wp14:editId="6982D886">
+            <wp:extent cx="7200900" cy="2597785"/>
+            <wp:effectExtent l="0" t="0" r="0" b="0"/>
+            <wp:docPr id="651995802" name="Picture 1"/>
+            <wp:cNvGraphicFramePr>
+              <a:graphicFrameLocks xmlns:a="http://schemas.openxmlformats.org/drawingml/2006/main" noChangeAspect="1"/>
+            </wp:cNvGraphicFramePr>
+            <a:graphic xmlns:a="http://schemas.openxmlformats.org/drawingml/2006/main">
+              <a:graphicData uri="http://schemas.openxmlformats.org/drawingml/2006/picture">
+                <pic:pic xmlns:pic="http://schemas.openxmlformats.org/drawingml/2006/picture">
+                  <pic:nvPicPr>
+                    <pic:cNvPr id="651995802" name=""/>
+                    <pic:cNvPicPr/>
+                  </pic:nvPicPr>
+                  <pic:blipFill>
+                    <a:blip r:embed="rId40"/>
+                    <a:stretch>
+                      <a:fillRect/>
+                    </a:stretch>
+                  </pic:blipFill>
+                  <pic:spPr>
+                    <a:xfrm>
+                      <a:off x="0" y="0"/>
+                      <a:ext cx="7200900" cy="2597785"/>
+                    </a:xfrm>
+                    <a:prstGeom prst="rect">
+                      <a:avLst/>
+                    </a:prstGeom>
+                  </pic:spPr>
+                </pic:pic>
+              </a:graphicData>
+            </a:graphic>
+          </wp:inline>
+        </w:drawing>
       </w:r>
     </w:p>
     <w:sectPr>
@@ -1656,6 +3862,119 @@
 <file path=word/numbering.xml><?xml version="1.0" encoding="utf-8"?>
 <w:numbering xmlns:wpc="http://schemas.microsoft.com/office/word/2010/wordprocessingCanvas" xmlns:cx="http://schemas.microsoft.com/office/drawing/2014/chartex" xmlns:cx1="http://schemas.microsoft.com/office/drawing/2015/9/8/chartex" xmlns:cx2="http://schemas.microsoft.com/office/drawing/2015/10/21/chartex" xmlns:cx3="http://schemas.microsoft.com/office/drawing/2016/5/9/chartex" xmlns:cx4="http://schemas.microsoft.com/office/drawing/2016/5/10/chartex" xmlns:cx5="http://schemas.microsoft.com/office/drawing/2016/5/11/chartex" xmlns:cx6="http://schemas.microsoft.com/office/drawing/2016/5/12/chartex" xmlns:cx7="http://schemas.microsoft.com/office/drawing/2016/5/13/chartex" xmlns:cx8="http://schemas.microsoft.com/office/drawing/2016/5/14/chartex" xmlns:mc="http://schemas.openxmlformats.org/markup-compatibility/2006" xmlns:aink="http://schemas.microsoft.com/office/drawing/2016/ink" xmlns:am3d="http://schemas.microsoft.com/office/drawing/2017/model3d" xmlns:o="urn:schemas-microsoft-com:office:office" xmlns:oel="http://schemas.microsoft.com/office/2019/extlst" xmlns:r="http://schemas.openxmlformats.org/officeDocument/2006/relationships" xmlns:m="http://schemas.openxmlformats.org/officeDocument/2006/math" xmlns:v="urn:schemas-microsoft-com:vml" xmlns:wp14="http://schemas.microsoft.com/office/word/2010/wordprocessingDrawing" xmlns:wp="http://schemas.openxmlformats.org/drawingml/2006/wordprocessingDrawing" xmlns:w10="urn:schemas-microsoft-com:office:word" xmlns:w="http://schemas.openxmlformats.org/wordprocessingml/2006/main" xmlns:w14="http://schemas.microsoft.com/office/word/2010/wordml" xmlns:w15="http://schemas.microsoft.com/office/word/2012/wordml" xmlns:w16cex="http://schemas.microsoft.com/office/word/2018/wordml/cex" xmlns:w16cid="http://schemas.microsoft.com/office/word/2016/wordml/cid" xmlns:w16="http://schemas.microsoft.com/office/word/2018/wordml" xmlns:w16du="http://schemas.microsoft.com/office/word/2023/wordml/word16du" xmlns:w16sdtdh="http://schemas.microsoft.com/office/word/2020/wordml/sdtdatahash" xmlns:w16sdtfl="http://schemas.microsoft.com/office/word/2024/wordml/sdtformatlock" xmlns:w16se="http://schemas.microsoft.com/office/word/2015/wordml/symex" xmlns:wpg="http://schemas.microsoft.com/office/word/2010/wordprocessingGroup" xmlns:wpi="http://schemas.microsoft.com/office/word/2010/wordprocessingInk" xmlns:wne="http://schemas.microsoft.com/office/word/2006/wordml" xmlns:wps="http://schemas.microsoft.com/office/word/2010/wordprocessingShape" mc:Ignorable="w14 w15 w16se w16cid w16 w16cex w16sdtdh w16sdtfl w16du wp14">
   <w:abstractNum w:abstractNumId="0" w15:restartNumberingAfterBreak="0">
+    <w:nsid w:val="0B4B7B61"/>
+    <w:multiLevelType w:val="multilevel"/>
+    <w:tmpl w:val="3906E846"/>
+    <w:lvl w:ilvl="0">
+      <w:start w:val="1"/>
+      <w:numFmt w:val="decimal"/>
+      <w:lvlText w:val="%1."/>
+      <w:lvlJc w:val="left"/>
+      <w:pPr>
+        <w:tabs>
+          <w:tab w:val="num" w:pos="720"/>
+        </w:tabs>
+        <w:ind w:left="720" w:hanging="360"/>
+      </w:pPr>
+    </w:lvl>
+    <w:lvl w:ilvl="1" w:tentative="1">
+      <w:start w:val="1"/>
+      <w:numFmt w:val="decimal"/>
+      <w:lvlText w:val="%2."/>
+      <w:lvlJc w:val="left"/>
+      <w:pPr>
+        <w:tabs>
+          <w:tab w:val="num" w:pos="1440"/>
+        </w:tabs>
+        <w:ind w:left="1440" w:hanging="360"/>
+      </w:pPr>
+    </w:lvl>
+    <w:lvl w:ilvl="2" w:tentative="1">
+      <w:start w:val="1"/>
+      <w:numFmt w:val="decimal"/>
+      <w:lvlText w:val="%3."/>
+      <w:lvlJc w:val="left"/>
+      <w:pPr>
+        <w:tabs>
+          <w:tab w:val="num" w:pos="2160"/>
+        </w:tabs>
+        <w:ind w:left="2160" w:hanging="360"/>
+      </w:pPr>
+    </w:lvl>
+    <w:lvl w:ilvl="3" w:tentative="1">
+      <w:start w:val="1"/>
+      <w:numFmt w:val="decimal"/>
+      <w:lvlText w:val="%4."/>
+      <w:lvlJc w:val="left"/>
+      <w:pPr>
+        <w:tabs>
+          <w:tab w:val="num" w:pos="2880"/>
+        </w:tabs>
+        <w:ind w:left="2880" w:hanging="360"/>
+      </w:pPr>
+    </w:lvl>
+    <w:lvl w:ilvl="4" w:tentative="1">
+      <w:start w:val="1"/>
+      <w:numFmt w:val="decimal"/>
+      <w:lvlText w:val="%5."/>
+      <w:lvlJc w:val="left"/>
+      <w:pPr>
+        <w:tabs>
+          <w:tab w:val="num" w:pos="3600"/>
+        </w:tabs>
+        <w:ind w:left="3600" w:hanging="360"/>
+      </w:pPr>
+    </w:lvl>
+    <w:lvl w:ilvl="5" w:tentative="1">
+      <w:start w:val="1"/>
+      <w:numFmt w:val="decimal"/>
+      <w:lvlText w:val="%6."/>
+      <w:lvlJc w:val="left"/>
+      <w:pPr>
+        <w:tabs>
+          <w:tab w:val="num" w:pos="4320"/>
+        </w:tabs>
+        <w:ind w:left="4320" w:hanging="360"/>
+      </w:pPr>
+    </w:lvl>
+    <w:lvl w:ilvl="6" w:tentative="1">
+      <w:start w:val="1"/>
+      <w:numFmt w:val="decimal"/>
+      <w:lvlText w:val="%7."/>
+      <w:lvlJc w:val="left"/>
+      <w:pPr>
+        <w:tabs>
+          <w:tab w:val="num" w:pos="5040"/>
+        </w:tabs>
+        <w:ind w:left="5040" w:hanging="360"/>
+      </w:pPr>
+    </w:lvl>
+    <w:lvl w:ilvl="7" w:tentative="1">
+      <w:start w:val="1"/>
+      <w:numFmt w:val="decimal"/>
+      <w:lvlText w:val="%8."/>
+      <w:lvlJc w:val="left"/>
+      <w:pPr>
+        <w:tabs>
+          <w:tab w:val="num" w:pos="5760"/>
+        </w:tabs>
+        <w:ind w:left="5760" w:hanging="360"/>
+      </w:pPr>
+    </w:lvl>
+    <w:lvl w:ilvl="8" w:tentative="1">
+      <w:start w:val="1"/>
+      <w:numFmt w:val="decimal"/>
+      <w:lvlText w:val="%9."/>
+      <w:lvlJc w:val="left"/>
+      <w:pPr>
+        <w:tabs>
+          <w:tab w:val="num" w:pos="6480"/>
+        </w:tabs>
+        <w:ind w:left="6480" w:hanging="360"/>
+      </w:pPr>
+    </w:lvl>
+  </w:abstractNum>
+  <w:abstractNum w:abstractNumId="1" w15:restartNumberingAfterBreak="0">
     <w:nsid w:val="1A45027E"/>
     <w:multiLevelType w:val="multilevel"/>
     <w:tmpl w:val="945885F8"/>
@@ -1768,7 +4087,120 @@
       </w:pPr>
     </w:lvl>
   </w:abstractNum>
-  <w:abstractNum w:abstractNumId="1" w15:restartNumberingAfterBreak="0">
+  <w:abstractNum w:abstractNumId="2" w15:restartNumberingAfterBreak="0">
+    <w:nsid w:val="27AC34B5"/>
+    <w:multiLevelType w:val="multilevel"/>
+    <w:tmpl w:val="A7FE614A"/>
+    <w:lvl w:ilvl="0">
+      <w:start w:val="1"/>
+      <w:numFmt w:val="decimal"/>
+      <w:lvlText w:val="%1."/>
+      <w:lvlJc w:val="left"/>
+      <w:pPr>
+        <w:tabs>
+          <w:tab w:val="num" w:pos="720"/>
+        </w:tabs>
+        <w:ind w:left="720" w:hanging="360"/>
+      </w:pPr>
+    </w:lvl>
+    <w:lvl w:ilvl="1" w:tentative="1">
+      <w:start w:val="1"/>
+      <w:numFmt w:val="decimal"/>
+      <w:lvlText w:val="%2."/>
+      <w:lvlJc w:val="left"/>
+      <w:pPr>
+        <w:tabs>
+          <w:tab w:val="num" w:pos="1440"/>
+        </w:tabs>
+        <w:ind w:left="1440" w:hanging="360"/>
+      </w:pPr>
+    </w:lvl>
+    <w:lvl w:ilvl="2" w:tentative="1">
+      <w:start w:val="1"/>
+      <w:numFmt w:val="decimal"/>
+      <w:lvlText w:val="%3."/>
+      <w:lvlJc w:val="left"/>
+      <w:pPr>
+        <w:tabs>
+          <w:tab w:val="num" w:pos="2160"/>
+        </w:tabs>
+        <w:ind w:left="2160" w:hanging="360"/>
+      </w:pPr>
+    </w:lvl>
+    <w:lvl w:ilvl="3" w:tentative="1">
+      <w:start w:val="1"/>
+      <w:numFmt w:val="decimal"/>
+      <w:lvlText w:val="%4."/>
+      <w:lvlJc w:val="left"/>
+      <w:pPr>
+        <w:tabs>
+          <w:tab w:val="num" w:pos="2880"/>
+        </w:tabs>
+        <w:ind w:left="2880" w:hanging="360"/>
+      </w:pPr>
+    </w:lvl>
+    <w:lvl w:ilvl="4" w:tentative="1">
+      <w:start w:val="1"/>
+      <w:numFmt w:val="decimal"/>
+      <w:lvlText w:val="%5."/>
+      <w:lvlJc w:val="left"/>
+      <w:pPr>
+        <w:tabs>
+          <w:tab w:val="num" w:pos="3600"/>
+        </w:tabs>
+        <w:ind w:left="3600" w:hanging="360"/>
+      </w:pPr>
+    </w:lvl>
+    <w:lvl w:ilvl="5" w:tentative="1">
+      <w:start w:val="1"/>
+      <w:numFmt w:val="decimal"/>
+      <w:lvlText w:val="%6."/>
+      <w:lvlJc w:val="left"/>
+      <w:pPr>
+        <w:tabs>
+          <w:tab w:val="num" w:pos="4320"/>
+        </w:tabs>
+        <w:ind w:left="4320" w:hanging="360"/>
+      </w:pPr>
+    </w:lvl>
+    <w:lvl w:ilvl="6" w:tentative="1">
+      <w:start w:val="1"/>
+      <w:numFmt w:val="decimal"/>
+      <w:lvlText w:val="%7."/>
+      <w:lvlJc w:val="left"/>
+      <w:pPr>
+        <w:tabs>
+          <w:tab w:val="num" w:pos="5040"/>
+        </w:tabs>
+        <w:ind w:left="5040" w:hanging="360"/>
+      </w:pPr>
+    </w:lvl>
+    <w:lvl w:ilvl="7" w:tentative="1">
+      <w:start w:val="1"/>
+      <w:numFmt w:val="decimal"/>
+      <w:lvlText w:val="%8."/>
+      <w:lvlJc w:val="left"/>
+      <w:pPr>
+        <w:tabs>
+          <w:tab w:val="num" w:pos="5760"/>
+        </w:tabs>
+        <w:ind w:left="5760" w:hanging="360"/>
+      </w:pPr>
+    </w:lvl>
+    <w:lvl w:ilvl="8" w:tentative="1">
+      <w:start w:val="1"/>
+      <w:numFmt w:val="decimal"/>
+      <w:lvlText w:val="%9."/>
+      <w:lvlJc w:val="left"/>
+      <w:pPr>
+        <w:tabs>
+          <w:tab w:val="num" w:pos="6480"/>
+        </w:tabs>
+        <w:ind w:left="6480" w:hanging="360"/>
+      </w:pPr>
+    </w:lvl>
+  </w:abstractNum>
+  <w:abstractNum w:abstractNumId="3" w15:restartNumberingAfterBreak="0">
     <w:nsid w:val="2C4C147B"/>
     <w:multiLevelType w:val="hybridMultilevel"/>
     <w:tmpl w:val="5000734C"/>
@@ -1857,7 +4289,120 @@
       </w:pPr>
     </w:lvl>
   </w:abstractNum>
-  <w:abstractNum w:abstractNumId="2" w15:restartNumberingAfterBreak="0">
+  <w:abstractNum w:abstractNumId="4" w15:restartNumberingAfterBreak="0">
+    <w:nsid w:val="30737043"/>
+    <w:multiLevelType w:val="multilevel"/>
+    <w:tmpl w:val="1DEEA442"/>
+    <w:lvl w:ilvl="0">
+      <w:start w:val="1"/>
+      <w:numFmt w:val="decimal"/>
+      <w:lvlText w:val="%1."/>
+      <w:lvlJc w:val="left"/>
+      <w:pPr>
+        <w:tabs>
+          <w:tab w:val="num" w:pos="720"/>
+        </w:tabs>
+        <w:ind w:left="720" w:hanging="360"/>
+      </w:pPr>
+    </w:lvl>
+    <w:lvl w:ilvl="1" w:tentative="1">
+      <w:start w:val="1"/>
+      <w:numFmt w:val="decimal"/>
+      <w:lvlText w:val="%2."/>
+      <w:lvlJc w:val="left"/>
+      <w:pPr>
+        <w:tabs>
+          <w:tab w:val="num" w:pos="1440"/>
+        </w:tabs>
+        <w:ind w:left="1440" w:hanging="360"/>
+      </w:pPr>
+    </w:lvl>
+    <w:lvl w:ilvl="2" w:tentative="1">
+      <w:start w:val="1"/>
+      <w:numFmt w:val="decimal"/>
+      <w:lvlText w:val="%3."/>
+      <w:lvlJc w:val="left"/>
+      <w:pPr>
+        <w:tabs>
+          <w:tab w:val="num" w:pos="2160"/>
+        </w:tabs>
+        <w:ind w:left="2160" w:hanging="360"/>
+      </w:pPr>
+    </w:lvl>
+    <w:lvl w:ilvl="3" w:tentative="1">
+      <w:start w:val="1"/>
+      <w:numFmt w:val="decimal"/>
+      <w:lvlText w:val="%4."/>
+      <w:lvlJc w:val="left"/>
+      <w:pPr>
+        <w:tabs>
+          <w:tab w:val="num" w:pos="2880"/>
+        </w:tabs>
+        <w:ind w:left="2880" w:hanging="360"/>
+      </w:pPr>
+    </w:lvl>
+    <w:lvl w:ilvl="4" w:tentative="1">
+      <w:start w:val="1"/>
+      <w:numFmt w:val="decimal"/>
+      <w:lvlText w:val="%5."/>
+      <w:lvlJc w:val="left"/>
+      <w:pPr>
+        <w:tabs>
+          <w:tab w:val="num" w:pos="3600"/>
+        </w:tabs>
+        <w:ind w:left="3600" w:hanging="360"/>
+      </w:pPr>
+    </w:lvl>
+    <w:lvl w:ilvl="5" w:tentative="1">
+      <w:start w:val="1"/>
+      <w:numFmt w:val="decimal"/>
+      <w:lvlText w:val="%6."/>
+      <w:lvlJc w:val="left"/>
+      <w:pPr>
+        <w:tabs>
+          <w:tab w:val="num" w:pos="4320"/>
+        </w:tabs>
+        <w:ind w:left="4320" w:hanging="360"/>
+      </w:pPr>
+    </w:lvl>
+    <w:lvl w:ilvl="6" w:tentative="1">
+      <w:start w:val="1"/>
+      <w:numFmt w:val="decimal"/>
+      <w:lvlText w:val="%7."/>
+      <w:lvlJc w:val="left"/>
+      <w:pPr>
+        <w:tabs>
+          <w:tab w:val="num" w:pos="5040"/>
+        </w:tabs>
+        <w:ind w:left="5040" w:hanging="360"/>
+      </w:pPr>
+    </w:lvl>
+    <w:lvl w:ilvl="7" w:tentative="1">
+      <w:start w:val="1"/>
+      <w:numFmt w:val="decimal"/>
+      <w:lvlText w:val="%8."/>
+      <w:lvlJc w:val="left"/>
+      <w:pPr>
+        <w:tabs>
+          <w:tab w:val="num" w:pos="5760"/>
+        </w:tabs>
+        <w:ind w:left="5760" w:hanging="360"/>
+      </w:pPr>
+    </w:lvl>
+    <w:lvl w:ilvl="8" w:tentative="1">
+      <w:start w:val="1"/>
+      <w:numFmt w:val="decimal"/>
+      <w:lvlText w:val="%9."/>
+      <w:lvlJc w:val="left"/>
+      <w:pPr>
+        <w:tabs>
+          <w:tab w:val="num" w:pos="6480"/>
+        </w:tabs>
+        <w:ind w:left="6480" w:hanging="360"/>
+      </w:pPr>
+    </w:lvl>
+  </w:abstractNum>
+  <w:abstractNum w:abstractNumId="5" w15:restartNumberingAfterBreak="0">
     <w:nsid w:val="618B6ACA"/>
     <w:multiLevelType w:val="multilevel"/>
     <w:tmpl w:val="0BEE2CA6"/>
@@ -1970,7 +4515,7 @@
       </w:pPr>
     </w:lvl>
   </w:abstractNum>
-  <w:abstractNum w:abstractNumId="3" w15:restartNumberingAfterBreak="0">
+  <w:abstractNum w:abstractNumId="6" w15:restartNumberingAfterBreak="0">
     <w:nsid w:val="65B1723C"/>
     <w:multiLevelType w:val="multilevel"/>
     <w:tmpl w:val="774AD372"/>
@@ -2084,16 +4629,25 @@
     </w:lvl>
   </w:abstractNum>
   <w:num w:numId="1" w16cid:durableId="101875162">
+    <w:abstractNumId w:val="1"/>
+  </w:num>
+  <w:num w:numId="2" w16cid:durableId="692608900">
+    <w:abstractNumId w:val="3"/>
+  </w:num>
+  <w:num w:numId="3" w16cid:durableId="701982733">
+    <w:abstractNumId w:val="5"/>
+  </w:num>
+  <w:num w:numId="4" w16cid:durableId="574819824">
+    <w:abstractNumId w:val="6"/>
+  </w:num>
+  <w:num w:numId="5" w16cid:durableId="566768327">
     <w:abstractNumId w:val="0"/>
   </w:num>
-  <w:num w:numId="2" w16cid:durableId="692608900">
-    <w:abstractNumId w:val="1"/>
-  </w:num>
-  <w:num w:numId="3" w16cid:durableId="701982733">
+  <w:num w:numId="6" w16cid:durableId="1618877151">
     <w:abstractNumId w:val="2"/>
   </w:num>
-  <w:num w:numId="4" w16cid:durableId="574819824">
-    <w:abstractNumId w:val="3"/>
+  <w:num w:numId="7" w16cid:durableId="180095811">
+    <w:abstractNumId w:val="4"/>
   </w:num>
 </w:numbering>
 </file>
@@ -3015,6 +5569,29 @@
       <w:spacing w:val="5"/>
     </w:rPr>
   </w:style>
+  <w:style w:type="character" w:styleId="Hyperlink">
+    <w:name w:val="Hyperlink"/>
+    <w:basedOn w:val="DefaultParagraphFont"/>
+    <w:uiPriority w:val="99"/>
+    <w:unhideWhenUsed/>
+    <w:rsid w:val="004F44D1"/>
+    <w:rPr>
+      <w:color w:val="0000FF"/>
+      <w:u w:val="single"/>
+    </w:rPr>
+  </w:style>
+  <w:style w:type="character" w:styleId="UnresolvedMention">
+    <w:name w:val="Unresolved Mention"/>
+    <w:basedOn w:val="DefaultParagraphFont"/>
+    <w:uiPriority w:val="99"/>
+    <w:semiHidden/>
+    <w:unhideWhenUsed/>
+    <w:rsid w:val="004F44D1"/>
+    <w:rPr>
+      <w:color w:val="605E5C"/>
+      <w:shd w:val="clear" w:color="auto" w:fill="E1DFDD"/>
+    </w:rPr>
+  </w:style>
 </w:styles>
 </file>
 

</xml_diff>